<commit_message>
logs: dual camera overlay + timestamp
</commit_message>
<xml_diff>
--- a/Recon logs.docx
+++ b/Recon logs.docx
@@ -311,7 +311,87 @@
           <w:numId w:val="3"/>
         </w:numPr>
       </w:pPr>
-    </w:p>
+      <w:r>
+        <w:t>Made Video Writer, which takes in each frame from both cameras + audio and composes them together and returns as a frame image</w:t>
+      </w:r>
+      <w:r>
+        <w:br/>
+      </w:r>
+    </w:p>
+    <w:p>
+      <w:pPr>
+        <w:rPr>
+          <w:b/>
+          <w:bCs/>
+        </w:rPr>
+      </w:pPr>
+      <w:r>
+        <w:rPr>
+          <w:b/>
+          <w:bCs/>
+        </w:rPr>
+        <w:t>Feb 13, 2026</w:t>
+      </w:r>
+    </w:p>
+    <w:p>
+      <w:pPr>
+        <w:pStyle w:val="ListParagraph"/>
+        <w:numPr>
+          <w:ilvl w:val="0"/>
+          <w:numId w:val="4"/>
+        </w:numPr>
+      </w:pPr>
+      <w:r>
+        <w:t xml:space="preserve">Fixed the front camera overlay to be rounded and in the corner by scaling it to 25% size and translating it to the corner. Shrink first, then reset origin to not mess up positioning. To create the rounded frame, first create a white rounded rectangle, convert to </w:t>
+      </w:r>
+      <w:proofErr w:type="spellStart"/>
+      <w:r>
+        <w:t>CIImage</w:t>
+      </w:r>
+      <w:proofErr w:type="spellEnd"/>
+      <w:r>
+        <w:t xml:space="preserve"> and position it over the front frame, so that only the parts of the camera in white are shown, rest is </w:t>
+      </w:r>
+      <w:proofErr w:type="gramStart"/>
+      <w:r>
+        <w:t>invisible</w:t>
+      </w:r>
+      <w:proofErr w:type="gramEnd"/>
+    </w:p>
+    <w:p>
+      <w:pPr>
+        <w:pStyle w:val="ListParagraph"/>
+        <w:numPr>
+          <w:ilvl w:val="0"/>
+          <w:numId w:val="4"/>
+        </w:numPr>
+      </w:pPr>
+      <w:r>
+        <w:t xml:space="preserve">Draw timestamp as </w:t>
+      </w:r>
+      <w:proofErr w:type="spellStart"/>
+      <w:r>
+        <w:t>UIImage</w:t>
+      </w:r>
+      <w:proofErr w:type="spellEnd"/>
+      <w:r>
+        <w:t xml:space="preserve"> and place convert to </w:t>
+      </w:r>
+      <w:proofErr w:type="spellStart"/>
+      <w:r>
+        <w:t>CIImage</w:t>
+      </w:r>
+      <w:proofErr w:type="spellEnd"/>
+      <w:r>
+        <w:t xml:space="preserve">, position over </w:t>
+      </w:r>
+      <w:proofErr w:type="gramStart"/>
+      <w:r>
+        <w:t>video</w:t>
+      </w:r>
+      <w:proofErr w:type="gramEnd"/>
+    </w:p>
+    <w:p/>
     <w:sectPr>
       <w:pgSz w:w="12240" w:h="15840"/>
       <w:pgMar w:top="1440" w:right="1440" w:bottom="1440" w:left="1440" w:header="708" w:footer="708" w:gutter="0"/>
@@ -438,6 +518,119 @@
     </w:lvl>
   </w:abstractNum>
   <w:abstractNum w:abstractNumId="1" w15:restartNumberingAfterBreak="0">
+    <w:nsid w:val="32616D01"/>
+    <w:multiLevelType w:val="hybridMultilevel"/>
+    <w:tmpl w:val="02364A86"/>
+    <w:lvl w:ilvl="0" w:tplc="04090001">
+      <w:start w:val="1"/>
+      <w:numFmt w:val="bullet"/>
+      <w:lvlText w:val=""/>
+      <w:lvlJc w:val="left"/>
+      <w:pPr>
+        <w:ind w:left="720" w:hanging="360"/>
+      </w:pPr>
+      <w:rPr>
+        <w:rFonts w:ascii="Symbol" w:hAnsi="Symbol" w:hint="default"/>
+      </w:rPr>
+    </w:lvl>
+    <w:lvl w:ilvl="1" w:tplc="04090003" w:tentative="1">
+      <w:start w:val="1"/>
+      <w:numFmt w:val="bullet"/>
+      <w:lvlText w:val="o"/>
+      <w:lvlJc w:val="left"/>
+      <w:pPr>
+        <w:ind w:left="1440" w:hanging="360"/>
+      </w:pPr>
+      <w:rPr>
+        <w:rFonts w:ascii="Courier New" w:hAnsi="Courier New" w:hint="default"/>
+      </w:rPr>
+    </w:lvl>
+    <w:lvl w:ilvl="2" w:tplc="04090005" w:tentative="1">
+      <w:start w:val="1"/>
+      <w:numFmt w:val="bullet"/>
+      <w:lvlText w:val=""/>
+      <w:lvlJc w:val="left"/>
+      <w:pPr>
+        <w:ind w:left="2160" w:hanging="360"/>
+      </w:pPr>
+      <w:rPr>
+        <w:rFonts w:ascii="Wingdings" w:hAnsi="Wingdings" w:hint="default"/>
+      </w:rPr>
+    </w:lvl>
+    <w:lvl w:ilvl="3" w:tplc="04090001" w:tentative="1">
+      <w:start w:val="1"/>
+      <w:numFmt w:val="bullet"/>
+      <w:lvlText w:val=""/>
+      <w:lvlJc w:val="left"/>
+      <w:pPr>
+        <w:ind w:left="2880" w:hanging="360"/>
+      </w:pPr>
+      <w:rPr>
+        <w:rFonts w:ascii="Symbol" w:hAnsi="Symbol" w:hint="default"/>
+      </w:rPr>
+    </w:lvl>
+    <w:lvl w:ilvl="4" w:tplc="04090003" w:tentative="1">
+      <w:start w:val="1"/>
+      <w:numFmt w:val="bullet"/>
+      <w:lvlText w:val="o"/>
+      <w:lvlJc w:val="left"/>
+      <w:pPr>
+        <w:ind w:left="3600" w:hanging="360"/>
+      </w:pPr>
+      <w:rPr>
+        <w:rFonts w:ascii="Courier New" w:hAnsi="Courier New" w:hint="default"/>
+      </w:rPr>
+    </w:lvl>
+    <w:lvl w:ilvl="5" w:tplc="04090005" w:tentative="1">
+      <w:start w:val="1"/>
+      <w:numFmt w:val="bullet"/>
+      <w:lvlText w:val=""/>
+      <w:lvlJc w:val="left"/>
+      <w:pPr>
+        <w:ind w:left="4320" w:hanging="360"/>
+      </w:pPr>
+      <w:rPr>
+        <w:rFonts w:ascii="Wingdings" w:hAnsi="Wingdings" w:hint="default"/>
+      </w:rPr>
+    </w:lvl>
+    <w:lvl w:ilvl="6" w:tplc="04090001" w:tentative="1">
+      <w:start w:val="1"/>
+      <w:numFmt w:val="bullet"/>
+      <w:lvlText w:val=""/>
+      <w:lvlJc w:val="left"/>
+      <w:pPr>
+        <w:ind w:left="5040" w:hanging="360"/>
+      </w:pPr>
+      <w:rPr>
+        <w:rFonts w:ascii="Symbol" w:hAnsi="Symbol" w:hint="default"/>
+      </w:rPr>
+    </w:lvl>
+    <w:lvl w:ilvl="7" w:tplc="04090003" w:tentative="1">
+      <w:start w:val="1"/>
+      <w:numFmt w:val="bullet"/>
+      <w:lvlText w:val="o"/>
+      <w:lvlJc w:val="left"/>
+      <w:pPr>
+        <w:ind w:left="5760" w:hanging="360"/>
+      </w:pPr>
+      <w:rPr>
+        <w:rFonts w:ascii="Courier New" w:hAnsi="Courier New" w:hint="default"/>
+      </w:rPr>
+    </w:lvl>
+    <w:lvl w:ilvl="8" w:tplc="04090005" w:tentative="1">
+      <w:start w:val="1"/>
+      <w:numFmt w:val="bullet"/>
+      <w:lvlText w:val=""/>
+      <w:lvlJc w:val="left"/>
+      <w:pPr>
+        <w:ind w:left="6480" w:hanging="360"/>
+      </w:pPr>
+      <w:rPr>
+        <w:rFonts w:ascii="Wingdings" w:hAnsi="Wingdings" w:hint="default"/>
+      </w:rPr>
+    </w:lvl>
+  </w:abstractNum>
+  <w:abstractNum w:abstractNumId="2" w15:restartNumberingAfterBreak="0">
     <w:nsid w:val="5D233F80"/>
     <w:multiLevelType w:val="hybridMultilevel"/>
     <w:tmpl w:val="B5B2EF32"/>
@@ -550,7 +743,7 @@
       </w:rPr>
     </w:lvl>
   </w:abstractNum>
-  <w:abstractNum w:abstractNumId="2" w15:restartNumberingAfterBreak="0">
+  <w:abstractNum w:abstractNumId="3" w15:restartNumberingAfterBreak="0">
     <w:nsid w:val="6EE05CBE"/>
     <w:multiLevelType w:val="hybridMultilevel"/>
     <w:tmpl w:val="515E1B30"/>
@@ -667,9 +860,12 @@
     <w:abstractNumId w:val="0"/>
   </w:num>
   <w:num w:numId="2" w16cid:durableId="1065492894">
+    <w:abstractNumId w:val="3"/>
+  </w:num>
+  <w:num w:numId="3" w16cid:durableId="1901019889">
     <w:abstractNumId w:val="2"/>
   </w:num>
-  <w:num w:numId="3" w16cid:durableId="1901019889">
+  <w:num w:numId="4" w16cid:durableId="452483282">
     <w:abstractNumId w:val="1"/>
   </w:num>
 </w:numbering>

</xml_diff>

<commit_message>
transcription service - audio recognition, restart service ~50s, convert audio buffer
</commit_message>
<xml_diff>
--- a/Recon logs.docx
+++ b/Recon logs.docx
@@ -391,7 +391,41 @@
       </w:r>
       <w:proofErr w:type="gramEnd"/>
     </w:p>
-    <w:p/>
+    <w:p>
+      <w:pPr>
+        <w:rPr>
+          <w:b/>
+          <w:bCs/>
+        </w:rPr>
+      </w:pPr>
+      <w:r>
+        <w:rPr>
+          <w:b/>
+          <w:bCs/>
+        </w:rPr>
+        <w:t>Feb 16, 2026</w:t>
+      </w:r>
+    </w:p>
+    <w:p>
+      <w:pPr>
+        <w:pStyle w:val="ListParagraph"/>
+        <w:numPr>
+          <w:ilvl w:val="0"/>
+          <w:numId w:val="5"/>
+        </w:numPr>
+      </w:pPr>
+      <w:r>
+        <w:t xml:space="preserve">Learning about Queues and background thread, Swift has multiple background threads and one main thread, and you can have asynchronous tasks on each thread. But each asynchronous task gets put into a </w:t>
+      </w:r>
+      <w:proofErr w:type="gramStart"/>
+      <w:r>
+        <w:t>Queue</w:t>
+      </w:r>
+      <w:proofErr w:type="gramEnd"/>
+      <w:r>
+        <w:t xml:space="preserve"> so the asynchronous tasks are asynchronous with the synchronous tasks, but all the asynchronous tasks are synchronous with each other and form a Queue. You can put them all in different background threads to be fully parallel. You can also name a Queue to serialize them and put certain services into the same thread if you wish them to execute in order when they depend on each other.</w:t>
+      </w:r>
+    </w:p>
     <w:sectPr>
       <w:pgSz w:w="12240" w:h="15840"/>
       <w:pgMar w:top="1440" w:right="1440" w:bottom="1440" w:left="1440" w:header="708" w:footer="708" w:gutter="0"/>
@@ -518,6 +552,119 @@
     </w:lvl>
   </w:abstractNum>
   <w:abstractNum w:abstractNumId="1" w15:restartNumberingAfterBreak="0">
+    <w:nsid w:val="32297CB9"/>
+    <w:multiLevelType w:val="hybridMultilevel"/>
+    <w:tmpl w:val="0BBCA938"/>
+    <w:lvl w:ilvl="0" w:tplc="04090001">
+      <w:start w:val="1"/>
+      <w:numFmt w:val="bullet"/>
+      <w:lvlText w:val=""/>
+      <w:lvlJc w:val="left"/>
+      <w:pPr>
+        <w:ind w:left="720" w:hanging="360"/>
+      </w:pPr>
+      <w:rPr>
+        <w:rFonts w:ascii="Symbol" w:hAnsi="Symbol" w:hint="default"/>
+      </w:rPr>
+    </w:lvl>
+    <w:lvl w:ilvl="1" w:tplc="04090003" w:tentative="1">
+      <w:start w:val="1"/>
+      <w:numFmt w:val="bullet"/>
+      <w:lvlText w:val="o"/>
+      <w:lvlJc w:val="left"/>
+      <w:pPr>
+        <w:ind w:left="1440" w:hanging="360"/>
+      </w:pPr>
+      <w:rPr>
+        <w:rFonts w:ascii="Courier New" w:hAnsi="Courier New" w:cs="Courier New" w:hint="default"/>
+      </w:rPr>
+    </w:lvl>
+    <w:lvl w:ilvl="2" w:tplc="04090005" w:tentative="1">
+      <w:start w:val="1"/>
+      <w:numFmt w:val="bullet"/>
+      <w:lvlText w:val=""/>
+      <w:lvlJc w:val="left"/>
+      <w:pPr>
+        <w:ind w:left="2160" w:hanging="360"/>
+      </w:pPr>
+      <w:rPr>
+        <w:rFonts w:ascii="Wingdings" w:hAnsi="Wingdings" w:hint="default"/>
+      </w:rPr>
+    </w:lvl>
+    <w:lvl w:ilvl="3" w:tplc="04090001" w:tentative="1">
+      <w:start w:val="1"/>
+      <w:numFmt w:val="bullet"/>
+      <w:lvlText w:val=""/>
+      <w:lvlJc w:val="left"/>
+      <w:pPr>
+        <w:ind w:left="2880" w:hanging="360"/>
+      </w:pPr>
+      <w:rPr>
+        <w:rFonts w:ascii="Symbol" w:hAnsi="Symbol" w:hint="default"/>
+      </w:rPr>
+    </w:lvl>
+    <w:lvl w:ilvl="4" w:tplc="04090003" w:tentative="1">
+      <w:start w:val="1"/>
+      <w:numFmt w:val="bullet"/>
+      <w:lvlText w:val="o"/>
+      <w:lvlJc w:val="left"/>
+      <w:pPr>
+        <w:ind w:left="3600" w:hanging="360"/>
+      </w:pPr>
+      <w:rPr>
+        <w:rFonts w:ascii="Courier New" w:hAnsi="Courier New" w:cs="Courier New" w:hint="default"/>
+      </w:rPr>
+    </w:lvl>
+    <w:lvl w:ilvl="5" w:tplc="04090005" w:tentative="1">
+      <w:start w:val="1"/>
+      <w:numFmt w:val="bullet"/>
+      <w:lvlText w:val=""/>
+      <w:lvlJc w:val="left"/>
+      <w:pPr>
+        <w:ind w:left="4320" w:hanging="360"/>
+      </w:pPr>
+      <w:rPr>
+        <w:rFonts w:ascii="Wingdings" w:hAnsi="Wingdings" w:hint="default"/>
+      </w:rPr>
+    </w:lvl>
+    <w:lvl w:ilvl="6" w:tplc="04090001" w:tentative="1">
+      <w:start w:val="1"/>
+      <w:numFmt w:val="bullet"/>
+      <w:lvlText w:val=""/>
+      <w:lvlJc w:val="left"/>
+      <w:pPr>
+        <w:ind w:left="5040" w:hanging="360"/>
+      </w:pPr>
+      <w:rPr>
+        <w:rFonts w:ascii="Symbol" w:hAnsi="Symbol" w:hint="default"/>
+      </w:rPr>
+    </w:lvl>
+    <w:lvl w:ilvl="7" w:tplc="04090003" w:tentative="1">
+      <w:start w:val="1"/>
+      <w:numFmt w:val="bullet"/>
+      <w:lvlText w:val="o"/>
+      <w:lvlJc w:val="left"/>
+      <w:pPr>
+        <w:ind w:left="5760" w:hanging="360"/>
+      </w:pPr>
+      <w:rPr>
+        <w:rFonts w:ascii="Courier New" w:hAnsi="Courier New" w:cs="Courier New" w:hint="default"/>
+      </w:rPr>
+    </w:lvl>
+    <w:lvl w:ilvl="8" w:tplc="04090005" w:tentative="1">
+      <w:start w:val="1"/>
+      <w:numFmt w:val="bullet"/>
+      <w:lvlText w:val=""/>
+      <w:lvlJc w:val="left"/>
+      <w:pPr>
+        <w:ind w:left="6480" w:hanging="360"/>
+      </w:pPr>
+      <w:rPr>
+        <w:rFonts w:ascii="Wingdings" w:hAnsi="Wingdings" w:hint="default"/>
+      </w:rPr>
+    </w:lvl>
+  </w:abstractNum>
+  <w:abstractNum w:abstractNumId="2" w15:restartNumberingAfterBreak="0">
     <w:nsid w:val="32616D01"/>
     <w:multiLevelType w:val="hybridMultilevel"/>
     <w:tmpl w:val="02364A86"/>
@@ -630,7 +777,7 @@
       </w:rPr>
     </w:lvl>
   </w:abstractNum>
-  <w:abstractNum w:abstractNumId="2" w15:restartNumberingAfterBreak="0">
+  <w:abstractNum w:abstractNumId="3" w15:restartNumberingAfterBreak="0">
     <w:nsid w:val="5D233F80"/>
     <w:multiLevelType w:val="hybridMultilevel"/>
     <w:tmpl w:val="B5B2EF32"/>
@@ -743,7 +890,7 @@
       </w:rPr>
     </w:lvl>
   </w:abstractNum>
-  <w:abstractNum w:abstractNumId="3" w15:restartNumberingAfterBreak="0">
+  <w:abstractNum w:abstractNumId="4" w15:restartNumberingAfterBreak="0">
     <w:nsid w:val="6EE05CBE"/>
     <w:multiLevelType w:val="hybridMultilevel"/>
     <w:tmpl w:val="515E1B30"/>
@@ -860,12 +1007,15 @@
     <w:abstractNumId w:val="0"/>
   </w:num>
   <w:num w:numId="2" w16cid:durableId="1065492894">
+    <w:abstractNumId w:val="4"/>
+  </w:num>
+  <w:num w:numId="3" w16cid:durableId="1901019889">
     <w:abstractNumId w:val="3"/>
   </w:num>
-  <w:num w:numId="3" w16cid:durableId="1901019889">
+  <w:num w:numId="4" w16cid:durableId="452483282">
     <w:abstractNumId w:val="2"/>
   </w:num>
-  <w:num w:numId="4" w16cid:durableId="452483282">
+  <w:num w:numId="5" w16cid:durableId="1832793299">
     <w:abstractNumId w:val="1"/>
   </w:num>
 </w:numbering>

</xml_diff>

<commit_message>
logs: lambda skeleton + temporary upload url
</commit_message>
<xml_diff>
--- a/Recon logs.docx
+++ b/Recon logs.docx
@@ -484,7 +484,50 @@
         </w:numPr>
       </w:pPr>
       <w:r>
-        <w:t>Will create an endpoint for video uploads, Lambda provides a temporary private URL that uploads straight to S3 since API gateway has 10MB limit and won’t allow videos</w:t>
+        <w:t xml:space="preserve">Will create an endpoint for video uploads, Lambda provides a temporary private URL that uploads straight to S3 since API gateway has 10MB limit and won’t allow </w:t>
+      </w:r>
+      <w:proofErr w:type="gramStart"/>
+      <w:r>
+        <w:t>videos</w:t>
+      </w:r>
+      <w:proofErr w:type="gramEnd"/>
+    </w:p>
+    <w:p>
+      <w:pPr>
+        <w:pStyle w:val="ListParagraph"/>
+        <w:numPr>
+          <w:ilvl w:val="0"/>
+          <w:numId w:val="5"/>
+        </w:numPr>
+      </w:pPr>
+      <w:r>
+        <w:t xml:space="preserve">Created Lambda serverless file </w:t>
+      </w:r>
+      <w:proofErr w:type="gramStart"/>
+      <w:r>
+        <w:t>skeleton</w:t>
+      </w:r>
+      <w:proofErr w:type="gramEnd"/>
+    </w:p>
+    <w:p>
+      <w:pPr>
+        <w:pStyle w:val="ListParagraph"/>
+        <w:numPr>
+          <w:ilvl w:val="0"/>
+          <w:numId w:val="5"/>
+        </w:numPr>
+      </w:pPr>
+      <w:r>
+        <w:lastRenderedPageBreak/>
+        <w:t xml:space="preserve">Generate temporary </w:t>
+      </w:r>
+      <w:proofErr w:type="spellStart"/>
+      <w:r>
+        <w:t>url</w:t>
+      </w:r>
+      <w:proofErr w:type="spellEnd"/>
+      <w:r>
+        <w:t xml:space="preserve"> for video upload</w:t>
       </w:r>
     </w:p>
     <w:sectPr>

</xml_diff>

<commit_message>
logs: AWS S3 presigning url
</commit_message>
<xml_diff>
--- a/Recon logs.docx
+++ b/Recon logs.docx
@@ -50,13 +50,8 @@
       </w:r>
       <w:proofErr w:type="spellEnd"/>
       <w:r>
-        <w:t xml:space="preserve"> for connecting the </w:t>
-      </w:r>
-      <w:proofErr w:type="gramStart"/>
-      <w:r>
-        <w:t>camera</w:t>
-      </w:r>
-      <w:proofErr w:type="gramEnd"/>
+        <w:t xml:space="preserve"> for connecting the camera</w:t>
+      </w:r>
     </w:p>
     <w:p>
       <w:pPr>
@@ -67,13 +62,8 @@
         </w:numPr>
       </w:pPr>
       <w:r>
-        <w:t xml:space="preserve">Added start and stop recording functions for the camera, update recording </w:t>
-      </w:r>
-      <w:proofErr w:type="gramStart"/>
-      <w:r>
-        <w:t>state</w:t>
-      </w:r>
-      <w:proofErr w:type="gramEnd"/>
+        <w:t>Added start and stop recording functions for the camera, update recording state</w:t>
+      </w:r>
     </w:p>
     <w:p>
       <w:pPr>
@@ -84,13 +74,8 @@
         </w:numPr>
       </w:pPr>
       <w:r>
-        <w:t xml:space="preserve">Tested out camera on iPhone </w:t>
-      </w:r>
-      <w:proofErr w:type="gramStart"/>
-      <w:r>
-        <w:t>15</w:t>
-      </w:r>
-      <w:proofErr w:type="gramEnd"/>
+        <w:t>Tested out camera on iPhone 15</w:t>
+      </w:r>
     </w:p>
     <w:p>
       <w:pPr>
@@ -109,13 +94,8 @@
       </w:r>
       <w:proofErr w:type="spellEnd"/>
       <w:r>
-        <w:t xml:space="preserve"> is defaulted to a size of 0, and then we attach the camera on top before resizing. Now, then camera player is the view’s </w:t>
-      </w:r>
-      <w:proofErr w:type="gramStart"/>
-      <w:r>
-        <w:t>layer</w:t>
-      </w:r>
-      <w:proofErr w:type="gramEnd"/>
+        <w:t xml:space="preserve"> is defaulted to a size of 0, and then we attach the camera on top before resizing. Now, then camera player is the view’s layer</w:t>
+      </w:r>
     </w:p>
     <w:p>
       <w:pPr>
@@ -126,13 +106,8 @@
         </w:numPr>
       </w:pPr>
       <w:r>
-        <w:t xml:space="preserve">Video gets saved to phone app’s private </w:t>
-      </w:r>
-      <w:proofErr w:type="gramStart"/>
-      <w:r>
-        <w:t>sandbox</w:t>
-      </w:r>
-      <w:proofErr w:type="gramEnd"/>
+        <w:t>Video gets saved to phone app’s private sandbox</w:t>
+      </w:r>
     </w:p>
     <w:p>
       <w:pPr>
@@ -171,13 +146,8 @@
       </w:r>
       <w:proofErr w:type="spellEnd"/>
       <w:r>
-        <w:t xml:space="preserve"> to accept multiple camera </w:t>
-      </w:r>
-      <w:proofErr w:type="gramStart"/>
-      <w:r>
-        <w:t>inputs</w:t>
-      </w:r>
-      <w:proofErr w:type="gramEnd"/>
+        <w:t xml:space="preserve"> to accept multiple camera inputs</w:t>
+      </w:r>
     </w:p>
     <w:p>
       <w:pPr>
@@ -209,13 +179,8 @@
       </w:r>
       <w:proofErr w:type="spellEnd"/>
       <w:r>
-        <w:t xml:space="preserve">) so you can modify raw video frames and composite them before saving, rather than writing directly to a </w:t>
-      </w:r>
-      <w:proofErr w:type="gramStart"/>
-      <w:r>
-        <w:t>file</w:t>
-      </w:r>
-      <w:proofErr w:type="gramEnd"/>
+        <w:t>) so you can modify raw video frames and composite them before saving, rather than writing directly to a file</w:t>
+      </w:r>
     </w:p>
     <w:p>
       <w:pPr>
@@ -226,13 +191,8 @@
         </w:numPr>
       </w:pPr>
       <w:r>
-        <w:t xml:space="preserve">Video compositor to take two frames (front and back), shrink the front to take up the </w:t>
-      </w:r>
-      <w:proofErr w:type="gramStart"/>
-      <w:r>
-        <w:t>corner</w:t>
-      </w:r>
-      <w:proofErr w:type="gramEnd"/>
+        <w:t>Video compositor to take two frames (front and back), shrink the front to take up the corner</w:t>
+      </w:r>
     </w:p>
     <w:p>
       <w:pPr>
@@ -278,13 +238,8 @@
         <w:t>Made GPS manager</w:t>
       </w:r>
       <w:r>
-        <w:t xml:space="preserve">, which asks for location permissions and updates location, start + stop location </w:t>
-      </w:r>
-      <w:proofErr w:type="gramStart"/>
-      <w:r>
-        <w:t>tracking</w:t>
-      </w:r>
-      <w:proofErr w:type="gramEnd"/>
+        <w:t>, which asks for location permissions and updates location, start + stop location tracking</w:t>
+      </w:r>
     </w:p>
     <w:p>
       <w:pPr>
@@ -295,13 +250,8 @@
         </w:numPr>
       </w:pPr>
       <w:r>
-        <w:t xml:space="preserve">Made Video compositor, which takes in front and back camera frame by frame images and overlays them into another frame image, with front 25% in corner on top of </w:t>
-      </w:r>
-      <w:proofErr w:type="gramStart"/>
-      <w:r>
-        <w:t>back</w:t>
-      </w:r>
-      <w:proofErr w:type="gramEnd"/>
+        <w:t>Made Video compositor, which takes in front and back camera frame by frame images and overlays them into another frame image, with front 25% in corner on top of back</w:t>
+      </w:r>
     </w:p>
     <w:p>
       <w:pPr>
@@ -350,13 +300,8 @@
       </w:r>
       <w:proofErr w:type="spellEnd"/>
       <w:r>
-        <w:t xml:space="preserve"> and position it over the front frame, so that only the parts of the camera in white are shown, rest is </w:t>
-      </w:r>
-      <w:proofErr w:type="gramStart"/>
-      <w:r>
-        <w:t>invisible</w:t>
-      </w:r>
-      <w:proofErr w:type="gramEnd"/>
+        <w:t xml:space="preserve"> and position it over the front frame, so that only the parts of the camera in white are shown, rest is invisible</w:t>
+      </w:r>
     </w:p>
     <w:p>
       <w:pPr>
@@ -383,13 +328,8 @@
       </w:r>
       <w:proofErr w:type="spellEnd"/>
       <w:r>
-        <w:t xml:space="preserve">, position over </w:t>
-      </w:r>
-      <w:proofErr w:type="gramStart"/>
-      <w:r>
-        <w:t>video</w:t>
-      </w:r>
-      <w:proofErr w:type="gramEnd"/>
+        <w:t>, position over video</w:t>
+      </w:r>
     </w:p>
     <w:p>
       <w:pPr>
@@ -415,15 +355,7 @@
         </w:numPr>
       </w:pPr>
       <w:r>
-        <w:t xml:space="preserve">Learning about Queues and background thread, Swift has multiple background threads and one main thread, and you can have asynchronous tasks on each thread. But each asynchronous task gets put into a </w:t>
-      </w:r>
-      <w:proofErr w:type="gramStart"/>
-      <w:r>
-        <w:t>Queue</w:t>
-      </w:r>
-      <w:proofErr w:type="gramEnd"/>
-      <w:r>
-        <w:t xml:space="preserve"> so the asynchronous tasks are asynchronous with the synchronous tasks, but all the asynchronous tasks are synchronous with each other and form a Queue. You can put them all in different background threads to be fully parallel. You can also name a Queue to serialize them and put certain services into the same thread if you wish them to execute in order when they depend on each other.</w:t>
+        <w:t>Learning about Queues and background thread, Swift has multiple background threads and one main thread, and you can have asynchronous tasks on each thread. But each asynchronous task gets put into a Queue so the asynchronous tasks are asynchronous with the synchronous tasks, but all the asynchronous tasks are synchronous with each other and form a Queue. You can put them all in different background threads to be fully parallel. You can also name a Queue to serialize them and put certain services into the same thread if you wish them to execute in order when they depend on each other.</w:t>
       </w:r>
     </w:p>
     <w:p>
@@ -435,13 +367,8 @@
         </w:numPr>
       </w:pPr>
       <w:r>
-        <w:t xml:space="preserve">Fixed transcript reset so it works on subsequent </w:t>
-      </w:r>
-      <w:proofErr w:type="gramStart"/>
-      <w:r>
-        <w:t>recordings</w:t>
-      </w:r>
-      <w:proofErr w:type="gramEnd"/>
+        <w:t>Fixed transcript reset so it works on subsequent recordings</w:t>
+      </w:r>
     </w:p>
     <w:p>
       <w:pPr>
@@ -455,13 +382,8 @@
         <w:t>Subsequent recordings start recording immediately</w:t>
       </w:r>
       <w:r>
-        <w:t xml:space="preserve"> – reduced </w:t>
-      </w:r>
-      <w:proofErr w:type="gramStart"/>
-      <w:r>
-        <w:t>latency</w:t>
-      </w:r>
-      <w:proofErr w:type="gramEnd"/>
+        <w:t xml:space="preserve"> – reduced latency</w:t>
+      </w:r>
     </w:p>
     <w:p>
       <w:pPr>
@@ -484,13 +406,8 @@
         </w:numPr>
       </w:pPr>
       <w:r>
-        <w:t xml:space="preserve">Will create an endpoint for video uploads, Lambda provides a temporary private URL that uploads straight to S3 since API gateway has 10MB limit and won’t allow </w:t>
-      </w:r>
-      <w:proofErr w:type="gramStart"/>
-      <w:r>
-        <w:t>videos</w:t>
-      </w:r>
-      <w:proofErr w:type="gramEnd"/>
+        <w:t>Will create an endpoint for video uploads, Lambda provides a temporary private URL that uploads straight to S3 since API gateway has 10MB limit and won’t allow videos</w:t>
+      </w:r>
     </w:p>
     <w:p>
       <w:pPr>
@@ -501,13 +418,8 @@
         </w:numPr>
       </w:pPr>
       <w:r>
-        <w:t xml:space="preserve">Created Lambda serverless file </w:t>
-      </w:r>
-      <w:proofErr w:type="gramStart"/>
-      <w:r>
-        <w:t>skeleton</w:t>
-      </w:r>
-      <w:proofErr w:type="gramEnd"/>
+        <w:t>Created Lambda serverless file skeleton</w:t>
+      </w:r>
     </w:p>
     <w:p>
       <w:pPr>
@@ -528,6 +440,44 @@
       <w:proofErr w:type="spellEnd"/>
       <w:r>
         <w:t xml:space="preserve"> for video upload</w:t>
+      </w:r>
+    </w:p>
+    <w:p>
+      <w:pPr>
+        <w:rPr>
+          <w:b/>
+          <w:bCs/>
+        </w:rPr>
+      </w:pPr>
+      <w:r>
+        <w:rPr>
+          <w:b/>
+          <w:bCs/>
+        </w:rPr>
+        <w:t>Feb 18, 2026</w:t>
+      </w:r>
+    </w:p>
+    <w:p>
+      <w:pPr>
+        <w:pStyle w:val="ListParagraph"/>
+        <w:numPr>
+          <w:ilvl w:val="0"/>
+          <w:numId w:val="6"/>
+        </w:numPr>
+      </w:pPr>
+      <w:r>
+        <w:t xml:space="preserve">Set up AWS </w:t>
+      </w:r>
+      <w:proofErr w:type="spellStart"/>
+      <w:r>
+        <w:t>presigning</w:t>
+      </w:r>
+      <w:proofErr w:type="spellEnd"/>
+      <w:r>
+        <w:t xml:space="preserve"> URL</w:t>
+      </w:r>
+      <w:r>
+        <w:t xml:space="preserve"> for S3 bucket</w:t>
       </w:r>
     </w:p>
     <w:sectPr>
@@ -543,6 +493,119 @@
 <file path=word/numbering.xml><?xml version="1.0" encoding="utf-8"?>
 <w:numbering xmlns:wpc="http://schemas.microsoft.com/office/word/2010/wordprocessingCanvas" xmlns:cx="http://schemas.microsoft.com/office/drawing/2014/chartex" xmlns:cx1="http://schemas.microsoft.com/office/drawing/2015/9/8/chartex" xmlns:cx2="http://schemas.microsoft.com/office/drawing/2015/10/21/chartex" xmlns:cx3="http://schemas.microsoft.com/office/drawing/2016/5/9/chartex" xmlns:cx4="http://schemas.microsoft.com/office/drawing/2016/5/10/chartex" xmlns:cx5="http://schemas.microsoft.com/office/drawing/2016/5/11/chartex" xmlns:cx6="http://schemas.microsoft.com/office/drawing/2016/5/12/chartex" xmlns:cx7="http://schemas.microsoft.com/office/drawing/2016/5/13/chartex" xmlns:cx8="http://schemas.microsoft.com/office/drawing/2016/5/14/chartex" xmlns:mc="http://schemas.openxmlformats.org/markup-compatibility/2006" xmlns:aink="http://schemas.microsoft.com/office/drawing/2016/ink" xmlns:am3d="http://schemas.microsoft.com/office/drawing/2017/model3d" xmlns:o="urn:schemas-microsoft-com:office:office" xmlns:oel="http://schemas.microsoft.com/office/2019/extlst" xmlns:r="http://schemas.openxmlformats.org/officeDocument/2006/relationships" xmlns:m="http://schemas.openxmlformats.org/officeDocument/2006/math" xmlns:v="urn:schemas-microsoft-com:vml" xmlns:wp14="http://schemas.microsoft.com/office/word/2010/wordprocessingDrawing" xmlns:wp="http://schemas.openxmlformats.org/drawingml/2006/wordprocessingDrawing" xmlns:w10="urn:schemas-microsoft-com:office:word" xmlns:w="http://schemas.openxmlformats.org/wordprocessingml/2006/main" xmlns:w14="http://schemas.microsoft.com/office/word/2010/wordml" xmlns:w15="http://schemas.microsoft.com/office/word/2012/wordml" xmlns:w16cex="http://schemas.microsoft.com/office/word/2018/wordml/cex" xmlns:w16cid="http://schemas.microsoft.com/office/word/2016/wordml/cid" xmlns:w16="http://schemas.microsoft.com/office/word/2018/wordml" xmlns:w16sdtdh="http://schemas.microsoft.com/office/word/2020/wordml/sdtdatahash" xmlns:w16se="http://schemas.microsoft.com/office/word/2015/wordml/symex" xmlns:wpg="http://schemas.microsoft.com/office/word/2010/wordprocessingGroup" xmlns:wpi="http://schemas.microsoft.com/office/word/2010/wordprocessingInk" xmlns:wne="http://schemas.microsoft.com/office/word/2006/wordml" xmlns:wps="http://schemas.microsoft.com/office/word/2010/wordprocessingShape" mc:Ignorable="w14 w15 w16se w16cid w16 w16cex w16sdtdh wp14">
   <w:abstractNum w:abstractNumId="0" w15:restartNumberingAfterBreak="0">
+    <w:nsid w:val="0FB664E1"/>
+    <w:multiLevelType w:val="hybridMultilevel"/>
+    <w:tmpl w:val="BF747760"/>
+    <w:lvl w:ilvl="0" w:tplc="04090001">
+      <w:start w:val="1"/>
+      <w:numFmt w:val="bullet"/>
+      <w:lvlText w:val=""/>
+      <w:lvlJc w:val="left"/>
+      <w:pPr>
+        <w:ind w:left="720" w:hanging="360"/>
+      </w:pPr>
+      <w:rPr>
+        <w:rFonts w:ascii="Symbol" w:hAnsi="Symbol" w:hint="default"/>
+      </w:rPr>
+    </w:lvl>
+    <w:lvl w:ilvl="1" w:tplc="04090003" w:tentative="1">
+      <w:start w:val="1"/>
+      <w:numFmt w:val="bullet"/>
+      <w:lvlText w:val="o"/>
+      <w:lvlJc w:val="left"/>
+      <w:pPr>
+        <w:ind w:left="1440" w:hanging="360"/>
+      </w:pPr>
+      <w:rPr>
+        <w:rFonts w:ascii="Courier New" w:hAnsi="Courier New" w:cs="Courier New" w:hint="default"/>
+      </w:rPr>
+    </w:lvl>
+    <w:lvl w:ilvl="2" w:tplc="04090005" w:tentative="1">
+      <w:start w:val="1"/>
+      <w:numFmt w:val="bullet"/>
+      <w:lvlText w:val=""/>
+      <w:lvlJc w:val="left"/>
+      <w:pPr>
+        <w:ind w:left="2160" w:hanging="360"/>
+      </w:pPr>
+      <w:rPr>
+        <w:rFonts w:ascii="Wingdings" w:hAnsi="Wingdings" w:hint="default"/>
+      </w:rPr>
+    </w:lvl>
+    <w:lvl w:ilvl="3" w:tplc="04090001" w:tentative="1">
+      <w:start w:val="1"/>
+      <w:numFmt w:val="bullet"/>
+      <w:lvlText w:val=""/>
+      <w:lvlJc w:val="left"/>
+      <w:pPr>
+        <w:ind w:left="2880" w:hanging="360"/>
+      </w:pPr>
+      <w:rPr>
+        <w:rFonts w:ascii="Symbol" w:hAnsi="Symbol" w:hint="default"/>
+      </w:rPr>
+    </w:lvl>
+    <w:lvl w:ilvl="4" w:tplc="04090003" w:tentative="1">
+      <w:start w:val="1"/>
+      <w:numFmt w:val="bullet"/>
+      <w:lvlText w:val="o"/>
+      <w:lvlJc w:val="left"/>
+      <w:pPr>
+        <w:ind w:left="3600" w:hanging="360"/>
+      </w:pPr>
+      <w:rPr>
+        <w:rFonts w:ascii="Courier New" w:hAnsi="Courier New" w:cs="Courier New" w:hint="default"/>
+      </w:rPr>
+    </w:lvl>
+    <w:lvl w:ilvl="5" w:tplc="04090005" w:tentative="1">
+      <w:start w:val="1"/>
+      <w:numFmt w:val="bullet"/>
+      <w:lvlText w:val=""/>
+      <w:lvlJc w:val="left"/>
+      <w:pPr>
+        <w:ind w:left="4320" w:hanging="360"/>
+      </w:pPr>
+      <w:rPr>
+        <w:rFonts w:ascii="Wingdings" w:hAnsi="Wingdings" w:hint="default"/>
+      </w:rPr>
+    </w:lvl>
+    <w:lvl w:ilvl="6" w:tplc="04090001" w:tentative="1">
+      <w:start w:val="1"/>
+      <w:numFmt w:val="bullet"/>
+      <w:lvlText w:val=""/>
+      <w:lvlJc w:val="left"/>
+      <w:pPr>
+        <w:ind w:left="5040" w:hanging="360"/>
+      </w:pPr>
+      <w:rPr>
+        <w:rFonts w:ascii="Symbol" w:hAnsi="Symbol" w:hint="default"/>
+      </w:rPr>
+    </w:lvl>
+    <w:lvl w:ilvl="7" w:tplc="04090003" w:tentative="1">
+      <w:start w:val="1"/>
+      <w:numFmt w:val="bullet"/>
+      <w:lvlText w:val="o"/>
+      <w:lvlJc w:val="left"/>
+      <w:pPr>
+        <w:ind w:left="5760" w:hanging="360"/>
+      </w:pPr>
+      <w:rPr>
+        <w:rFonts w:ascii="Courier New" w:hAnsi="Courier New" w:cs="Courier New" w:hint="default"/>
+      </w:rPr>
+    </w:lvl>
+    <w:lvl w:ilvl="8" w:tplc="04090005" w:tentative="1">
+      <w:start w:val="1"/>
+      <w:numFmt w:val="bullet"/>
+      <w:lvlText w:val=""/>
+      <w:lvlJc w:val="left"/>
+      <w:pPr>
+        <w:ind w:left="6480" w:hanging="360"/>
+      </w:pPr>
+      <w:rPr>
+        <w:rFonts w:ascii="Wingdings" w:hAnsi="Wingdings" w:hint="default"/>
+      </w:rPr>
+    </w:lvl>
+  </w:abstractNum>
+  <w:abstractNum w:abstractNumId="1" w15:restartNumberingAfterBreak="0">
     <w:nsid w:val="208A7E61"/>
     <w:multiLevelType w:val="hybridMultilevel"/>
     <w:tmpl w:val="58EA8306"/>
@@ -655,7 +718,7 @@
       </w:rPr>
     </w:lvl>
   </w:abstractNum>
-  <w:abstractNum w:abstractNumId="1" w15:restartNumberingAfterBreak="0">
+  <w:abstractNum w:abstractNumId="2" w15:restartNumberingAfterBreak="0">
     <w:nsid w:val="32297CB9"/>
     <w:multiLevelType w:val="hybridMultilevel"/>
     <w:tmpl w:val="0BBCA938"/>
@@ -768,7 +831,7 @@
       </w:rPr>
     </w:lvl>
   </w:abstractNum>
-  <w:abstractNum w:abstractNumId="2" w15:restartNumberingAfterBreak="0">
+  <w:abstractNum w:abstractNumId="3" w15:restartNumberingAfterBreak="0">
     <w:nsid w:val="32616D01"/>
     <w:multiLevelType w:val="hybridMultilevel"/>
     <w:tmpl w:val="02364A86"/>
@@ -881,7 +944,7 @@
       </w:rPr>
     </w:lvl>
   </w:abstractNum>
-  <w:abstractNum w:abstractNumId="3" w15:restartNumberingAfterBreak="0">
+  <w:abstractNum w:abstractNumId="4" w15:restartNumberingAfterBreak="0">
     <w:nsid w:val="5D233F80"/>
     <w:multiLevelType w:val="hybridMultilevel"/>
     <w:tmpl w:val="B5B2EF32"/>
@@ -994,7 +1057,7 @@
       </w:rPr>
     </w:lvl>
   </w:abstractNum>
-  <w:abstractNum w:abstractNumId="4" w15:restartNumberingAfterBreak="0">
+  <w:abstractNum w:abstractNumId="5" w15:restartNumberingAfterBreak="0">
     <w:nsid w:val="6EE05CBE"/>
     <w:multiLevelType w:val="hybridMultilevel"/>
     <w:tmpl w:val="515E1B30"/>
@@ -1108,19 +1171,22 @@
     </w:lvl>
   </w:abstractNum>
   <w:num w:numId="1" w16cid:durableId="746195948">
-    <w:abstractNumId w:val="0"/>
+    <w:abstractNumId w:val="1"/>
   </w:num>
   <w:num w:numId="2" w16cid:durableId="1065492894">
+    <w:abstractNumId w:val="5"/>
+  </w:num>
+  <w:num w:numId="3" w16cid:durableId="1901019889">
     <w:abstractNumId w:val="4"/>
   </w:num>
-  <w:num w:numId="3" w16cid:durableId="1901019889">
+  <w:num w:numId="4" w16cid:durableId="452483282">
     <w:abstractNumId w:val="3"/>
   </w:num>
-  <w:num w:numId="4" w16cid:durableId="452483282">
+  <w:num w:numId="5" w16cid:durableId="1832793299">
     <w:abstractNumId w:val="2"/>
   </w:num>
-  <w:num w:numId="5" w16cid:durableId="1832793299">
-    <w:abstractNumId w:val="1"/>
+  <w:num w:numId="6" w16cid:durableId="1140150217">
+    <w:abstractNumId w:val="0"/>
   </w:num>
 </w:numbering>
 </file>

</xml_diff>

<commit_message>
logs: amazon bedrock -> openai sdk
</commit_message>
<xml_diff>
--- a/Recon logs.docx
+++ b/Recon logs.docx
@@ -50,8 +50,13 @@
       </w:r>
       <w:proofErr w:type="spellEnd"/>
       <w:r>
-        <w:t xml:space="preserve"> for connecting the camera</w:t>
-      </w:r>
+        <w:t xml:space="preserve"> for connecting the </w:t>
+      </w:r>
+      <w:proofErr w:type="gramStart"/>
+      <w:r>
+        <w:t>camera</w:t>
+      </w:r>
+      <w:proofErr w:type="gramEnd"/>
     </w:p>
     <w:p>
       <w:pPr>
@@ -62,8 +67,13 @@
         </w:numPr>
       </w:pPr>
       <w:r>
-        <w:t>Added start and stop recording functions for the camera, update recording state</w:t>
-      </w:r>
+        <w:t xml:space="preserve">Added start and stop recording functions for the camera, update recording </w:t>
+      </w:r>
+      <w:proofErr w:type="gramStart"/>
+      <w:r>
+        <w:t>state</w:t>
+      </w:r>
+      <w:proofErr w:type="gramEnd"/>
     </w:p>
     <w:p>
       <w:pPr>
@@ -74,8 +84,13 @@
         </w:numPr>
       </w:pPr>
       <w:r>
-        <w:t>Tested out camera on iPhone 15</w:t>
-      </w:r>
+        <w:t xml:space="preserve">Tested out camera on iPhone </w:t>
+      </w:r>
+      <w:proofErr w:type="gramStart"/>
+      <w:r>
+        <w:t>15</w:t>
+      </w:r>
+      <w:proofErr w:type="gramEnd"/>
     </w:p>
     <w:p>
       <w:pPr>
@@ -94,8 +109,13 @@
       </w:r>
       <w:proofErr w:type="spellEnd"/>
       <w:r>
-        <w:t xml:space="preserve"> is defaulted to a size of 0, and then we attach the camera on top before resizing. Now, then camera player is the view’s layer</w:t>
-      </w:r>
+        <w:t xml:space="preserve"> is defaulted to a size of 0, and then we attach the camera on top before resizing. Now, then camera player is the view’s </w:t>
+      </w:r>
+      <w:proofErr w:type="gramStart"/>
+      <w:r>
+        <w:t>layer</w:t>
+      </w:r>
+      <w:proofErr w:type="gramEnd"/>
     </w:p>
     <w:p>
       <w:pPr>
@@ -106,8 +126,13 @@
         </w:numPr>
       </w:pPr>
       <w:r>
-        <w:t>Video gets saved to phone app’s private sandbox</w:t>
-      </w:r>
+        <w:t xml:space="preserve">Video gets saved to phone app’s private </w:t>
+      </w:r>
+      <w:proofErr w:type="gramStart"/>
+      <w:r>
+        <w:t>sandbox</w:t>
+      </w:r>
+      <w:proofErr w:type="gramEnd"/>
     </w:p>
     <w:p>
       <w:pPr>
@@ -146,8 +171,13 @@
       </w:r>
       <w:proofErr w:type="spellEnd"/>
       <w:r>
-        <w:t xml:space="preserve"> to accept multiple camera inputs</w:t>
-      </w:r>
+        <w:t xml:space="preserve"> to accept multiple camera </w:t>
+      </w:r>
+      <w:proofErr w:type="gramStart"/>
+      <w:r>
+        <w:t>inputs</w:t>
+      </w:r>
+      <w:proofErr w:type="gramEnd"/>
     </w:p>
     <w:p>
       <w:pPr>
@@ -179,8 +209,13 @@
       </w:r>
       <w:proofErr w:type="spellEnd"/>
       <w:r>
-        <w:t>) so you can modify raw video frames and composite them before saving, rather than writing directly to a file</w:t>
-      </w:r>
+        <w:t xml:space="preserve">) so you can modify raw video frames and composite them before saving, rather than writing directly to a </w:t>
+      </w:r>
+      <w:proofErr w:type="gramStart"/>
+      <w:r>
+        <w:t>file</w:t>
+      </w:r>
+      <w:proofErr w:type="gramEnd"/>
     </w:p>
     <w:p>
       <w:pPr>
@@ -191,8 +226,13 @@
         </w:numPr>
       </w:pPr>
       <w:r>
-        <w:t>Video compositor to take two frames (front and back), shrink the front to take up the corner</w:t>
-      </w:r>
+        <w:t xml:space="preserve">Video compositor to take two frames (front and back), shrink the front to take up the </w:t>
+      </w:r>
+      <w:proofErr w:type="gramStart"/>
+      <w:r>
+        <w:t>corner</w:t>
+      </w:r>
+      <w:proofErr w:type="gramEnd"/>
     </w:p>
     <w:p>
       <w:pPr>
@@ -238,8 +278,13 @@
         <w:t>Made GPS manager</w:t>
       </w:r>
       <w:r>
-        <w:t>, which asks for location permissions and updates location, start + stop location tracking</w:t>
-      </w:r>
+        <w:t xml:space="preserve">, which asks for location permissions and updates location, start + stop location </w:t>
+      </w:r>
+      <w:proofErr w:type="gramStart"/>
+      <w:r>
+        <w:t>tracking</w:t>
+      </w:r>
+      <w:proofErr w:type="gramEnd"/>
     </w:p>
     <w:p>
       <w:pPr>
@@ -250,8 +295,13 @@
         </w:numPr>
       </w:pPr>
       <w:r>
-        <w:t>Made Video compositor, which takes in front and back camera frame by frame images and overlays them into another frame image, with front 25% in corner on top of back</w:t>
-      </w:r>
+        <w:t xml:space="preserve">Made Video compositor, which takes in front and back camera frame by frame images and overlays them into another frame image, with front 25% in corner on top of </w:t>
+      </w:r>
+      <w:proofErr w:type="gramStart"/>
+      <w:r>
+        <w:t>back</w:t>
+      </w:r>
+      <w:proofErr w:type="gramEnd"/>
     </w:p>
     <w:p>
       <w:pPr>
@@ -300,8 +350,13 @@
       </w:r>
       <w:proofErr w:type="spellEnd"/>
       <w:r>
-        <w:t xml:space="preserve"> and position it over the front frame, so that only the parts of the camera in white are shown, rest is invisible</w:t>
-      </w:r>
+        <w:t xml:space="preserve"> and position it over the front frame, so that only the parts of the camera in white are shown, rest is </w:t>
+      </w:r>
+      <w:proofErr w:type="gramStart"/>
+      <w:r>
+        <w:t>invisible</w:t>
+      </w:r>
+      <w:proofErr w:type="gramEnd"/>
     </w:p>
     <w:p>
       <w:pPr>
@@ -328,8 +383,13 @@
       </w:r>
       <w:proofErr w:type="spellEnd"/>
       <w:r>
-        <w:t>, position over video</w:t>
-      </w:r>
+        <w:t xml:space="preserve">, position over </w:t>
+      </w:r>
+      <w:proofErr w:type="gramStart"/>
+      <w:r>
+        <w:t>video</w:t>
+      </w:r>
+      <w:proofErr w:type="gramEnd"/>
     </w:p>
     <w:p>
       <w:pPr>
@@ -355,7 +415,15 @@
         </w:numPr>
       </w:pPr>
       <w:r>
-        <w:t>Learning about Queues and background thread, Swift has multiple background threads and one main thread, and you can have asynchronous tasks on each thread. But each asynchronous task gets put into a Queue so the asynchronous tasks are asynchronous with the synchronous tasks, but all the asynchronous tasks are synchronous with each other and form a Queue. You can put them all in different background threads to be fully parallel. You can also name a Queue to serialize them and put certain services into the same thread if you wish them to execute in order when they depend on each other.</w:t>
+        <w:t xml:space="preserve">Learning about Queues and background thread, Swift has multiple background threads and one main thread, and you can have asynchronous tasks on each thread. But each asynchronous task gets put into a </w:t>
+      </w:r>
+      <w:proofErr w:type="gramStart"/>
+      <w:r>
+        <w:t>Queue</w:t>
+      </w:r>
+      <w:proofErr w:type="gramEnd"/>
+      <w:r>
+        <w:t xml:space="preserve"> so the asynchronous tasks are asynchronous with the synchronous tasks, but all the asynchronous tasks are synchronous with each other and form a Queue. You can put them all in different background threads to be fully parallel. You can also name a Queue to serialize them and put certain services into the same thread if you wish them to execute in order when they depend on each other.</w:t>
       </w:r>
     </w:p>
     <w:p>
@@ -367,8 +435,13 @@
         </w:numPr>
       </w:pPr>
       <w:r>
-        <w:t>Fixed transcript reset so it works on subsequent recordings</w:t>
-      </w:r>
+        <w:t xml:space="preserve">Fixed transcript reset so it works on subsequent </w:t>
+      </w:r>
+      <w:proofErr w:type="gramStart"/>
+      <w:r>
+        <w:t>recordings</w:t>
+      </w:r>
+      <w:proofErr w:type="gramEnd"/>
     </w:p>
     <w:p>
       <w:pPr>
@@ -382,8 +455,13 @@
         <w:t>Subsequent recordings start recording immediately</w:t>
       </w:r>
       <w:r>
-        <w:t xml:space="preserve"> – reduced latency</w:t>
-      </w:r>
+        <w:t xml:space="preserve"> – reduced </w:t>
+      </w:r>
+      <w:proofErr w:type="gramStart"/>
+      <w:r>
+        <w:t>latency</w:t>
+      </w:r>
+      <w:proofErr w:type="gramEnd"/>
     </w:p>
     <w:p>
       <w:pPr>
@@ -406,8 +484,13 @@
         </w:numPr>
       </w:pPr>
       <w:r>
-        <w:t>Will create an endpoint for video uploads, Lambda provides a temporary private URL that uploads straight to S3 since API gateway has 10MB limit and won’t allow videos</w:t>
-      </w:r>
+        <w:t xml:space="preserve">Will create an endpoint for video uploads, Lambda provides a temporary private URL that uploads straight to S3 since API gateway has 10MB limit and won’t allow </w:t>
+      </w:r>
+      <w:proofErr w:type="gramStart"/>
+      <w:r>
+        <w:t>videos</w:t>
+      </w:r>
+      <w:proofErr w:type="gramEnd"/>
     </w:p>
     <w:p>
       <w:pPr>
@@ -418,8 +501,13 @@
         </w:numPr>
       </w:pPr>
       <w:r>
-        <w:t>Created Lambda serverless file skeleton</w:t>
-      </w:r>
+        <w:t xml:space="preserve">Created Lambda serverless file </w:t>
+      </w:r>
+      <w:proofErr w:type="gramStart"/>
+      <w:r>
+        <w:t>skeleton</w:t>
+      </w:r>
+      <w:proofErr w:type="gramEnd"/>
     </w:p>
     <w:p>
       <w:pPr>
@@ -439,8 +527,13 @@
       </w:r>
       <w:proofErr w:type="spellEnd"/>
       <w:r>
-        <w:t xml:space="preserve"> for video upload</w:t>
-      </w:r>
+        <w:t xml:space="preserve"> for video </w:t>
+      </w:r>
+      <w:proofErr w:type="gramStart"/>
+      <w:r>
+        <w:t>upload</w:t>
+      </w:r>
+      <w:proofErr w:type="gramEnd"/>
     </w:p>
     <w:p>
       <w:pPr>
@@ -477,7 +570,47 @@
         <w:t xml:space="preserve"> URL</w:t>
       </w:r>
       <w:r>
-        <w:t xml:space="preserve"> for S3 bucket</w:t>
+        <w:t xml:space="preserve"> for S3 </w:t>
+      </w:r>
+      <w:proofErr w:type="gramStart"/>
+      <w:r>
+        <w:t>bucket</w:t>
+      </w:r>
+      <w:proofErr w:type="gramEnd"/>
+    </w:p>
+    <w:p>
+      <w:pPr>
+        <w:rPr>
+          <w:b/>
+          <w:bCs/>
+        </w:rPr>
+      </w:pPr>
+      <w:r>
+        <w:rPr>
+          <w:b/>
+          <w:bCs/>
+        </w:rPr>
+        <w:t>Feb 23, 2026</w:t>
+      </w:r>
+    </w:p>
+    <w:p>
+      <w:pPr>
+        <w:pStyle w:val="ListParagraph"/>
+        <w:numPr>
+          <w:ilvl w:val="0"/>
+          <w:numId w:val="6"/>
+        </w:numPr>
+      </w:pPr>
+      <w:r>
+        <w:t xml:space="preserve">Amazon Bedrock doesn’t work and has significant rate limit issues, switching to </w:t>
+      </w:r>
+      <w:proofErr w:type="spellStart"/>
+      <w:r>
+        <w:t>OpenAI</w:t>
+      </w:r>
+      <w:proofErr w:type="spellEnd"/>
+      <w:r>
+        <w:t xml:space="preserve"> SDK to call Nova directly, bypassing the rate limit</w:t>
       </w:r>
     </w:p>
     <w:sectPr>
@@ -495,7 +628,7 @@
   <w:abstractNum w:abstractNumId="0" w15:restartNumberingAfterBreak="0">
     <w:nsid w:val="0FB664E1"/>
     <w:multiLevelType w:val="hybridMultilevel"/>
-    <w:tmpl w:val="BF747760"/>
+    <w:tmpl w:val="E2C06A82"/>
     <w:lvl w:ilvl="0" w:tplc="04090001">
       <w:start w:val="1"/>
       <w:numFmt w:val="bullet"/>

</xml_diff>

<commit_message>
nova 2 lite backend now works, proper documentation added
</commit_message>
<xml_diff>
--- a/Recon logs.docx
+++ b/Recon logs.docx
@@ -455,13 +455,8 @@
         <w:t>Subsequent recordings start recording immediately</w:t>
       </w:r>
       <w:r>
-        <w:t xml:space="preserve"> – reduced </w:t>
-      </w:r>
-      <w:proofErr w:type="gramStart"/>
-      <w:r>
-        <w:t>latency</w:t>
-      </w:r>
-      <w:proofErr w:type="gramEnd"/>
+        <w:t xml:space="preserve"> – reduced latency</w:t>
+      </w:r>
     </w:p>
     <w:p>
       <w:pPr>
@@ -484,13 +479,8 @@
         </w:numPr>
       </w:pPr>
       <w:r>
-        <w:t xml:space="preserve">Will create an endpoint for video uploads, Lambda provides a temporary private URL that uploads straight to S3 since API gateway has 10MB limit and won’t allow </w:t>
-      </w:r>
-      <w:proofErr w:type="gramStart"/>
-      <w:r>
-        <w:t>videos</w:t>
-      </w:r>
-      <w:proofErr w:type="gramEnd"/>
+        <w:t>Will create an endpoint for video uploads, Lambda provides a temporary private URL that uploads straight to S3 since API gateway has 10MB limit and won’t allow videos</w:t>
+      </w:r>
     </w:p>
     <w:p>
       <w:pPr>
@@ -501,13 +491,8 @@
         </w:numPr>
       </w:pPr>
       <w:r>
-        <w:t xml:space="preserve">Created Lambda serverless file </w:t>
-      </w:r>
-      <w:proofErr w:type="gramStart"/>
-      <w:r>
-        <w:t>skeleton</w:t>
-      </w:r>
-      <w:proofErr w:type="gramEnd"/>
+        <w:t>Created Lambda serverless file skeleton</w:t>
+      </w:r>
     </w:p>
     <w:p>
       <w:pPr>
@@ -527,13 +512,8 @@
       </w:r>
       <w:proofErr w:type="spellEnd"/>
       <w:r>
-        <w:t xml:space="preserve"> for video </w:t>
-      </w:r>
-      <w:proofErr w:type="gramStart"/>
-      <w:r>
-        <w:t>upload</w:t>
-      </w:r>
-      <w:proofErr w:type="gramEnd"/>
+        <w:t xml:space="preserve"> for video upload</w:t>
+      </w:r>
     </w:p>
     <w:p>
       <w:pPr>
@@ -570,13 +550,8 @@
         <w:t xml:space="preserve"> URL</w:t>
       </w:r>
       <w:r>
-        <w:t xml:space="preserve"> for S3 </w:t>
-      </w:r>
-      <w:proofErr w:type="gramStart"/>
-      <w:r>
-        <w:t>bucket</w:t>
-      </w:r>
-      <w:proofErr w:type="gramEnd"/>
+        <w:t xml:space="preserve"> for S3 bucket</w:t>
+      </w:r>
     </w:p>
     <w:p>
       <w:pPr>
@@ -611,6 +586,80 @@
       <w:proofErr w:type="spellEnd"/>
       <w:r>
         <w:t xml:space="preserve"> SDK to call Nova directly, bypassing the rate limit</w:t>
+      </w:r>
+    </w:p>
+    <w:p>
+      <w:pPr>
+        <w:pStyle w:val="ListParagraph"/>
+        <w:numPr>
+          <w:ilvl w:val="0"/>
+          <w:numId w:val="6"/>
+        </w:numPr>
+      </w:pPr>
+      <w:r>
+        <w:t xml:space="preserve">Added Lambda layer for open ai </w:t>
+      </w:r>
+      <w:proofErr w:type="spellStart"/>
+      <w:r>
+        <w:t>sdk</w:t>
+      </w:r>
+      <w:proofErr w:type="spellEnd"/>
+    </w:p>
+    <w:p>
+      <w:pPr>
+        <w:pStyle w:val="ListParagraph"/>
+        <w:numPr>
+          <w:ilvl w:val="0"/>
+          <w:numId w:val="6"/>
+        </w:numPr>
+      </w:pPr>
+      <w:proofErr w:type="spellStart"/>
+      <w:r>
+        <w:t>OpenAI</w:t>
+      </w:r>
+      <w:proofErr w:type="spellEnd"/>
+      <w:r>
+        <w:t xml:space="preserve"> package depends on </w:t>
+      </w:r>
+      <w:proofErr w:type="spellStart"/>
+      <w:r>
+        <w:t>pydantic</w:t>
+      </w:r>
+      <w:proofErr w:type="spellEnd"/>
+      <w:r>
+        <w:t xml:space="preserve"> which is written in C/Rust. Pip install on Mac downloads binaries compiled for arm64, whereas Lambda runs on Amazon Linux</w:t>
+      </w:r>
+    </w:p>
+    <w:p>
+      <w:pPr>
+        <w:pStyle w:val="ListParagraph"/>
+        <w:numPr>
+          <w:ilvl w:val="0"/>
+          <w:numId w:val="6"/>
+        </w:numPr>
+      </w:pPr>
+      <w:r>
+        <w:t xml:space="preserve">Ran a Docker container to install and zip the python </w:t>
+      </w:r>
+      <w:proofErr w:type="spellStart"/>
+      <w:r>
+        <w:t>sdk</w:t>
+      </w:r>
+      <w:proofErr w:type="spellEnd"/>
+      <w:r>
+        <w:t xml:space="preserve"> in Linux, then uploaded to Lambda</w:t>
+      </w:r>
+    </w:p>
+    <w:p>
+      <w:pPr>
+        <w:pStyle w:val="ListParagraph"/>
+        <w:numPr>
+          <w:ilvl w:val="0"/>
+          <w:numId w:val="6"/>
+        </w:numPr>
+      </w:pPr>
+      <w:r>
+        <w:t>After analyzing the video documentation, NOVA 2 LITE WORKS</w:t>
       </w:r>
     </w:p>
     <w:sectPr>

</xml_diff>

<commit_message>
removed nova 2 sonic
</commit_message>
<xml_diff>
--- a/Recon logs.docx
+++ b/Recon logs.docx
@@ -455,8 +455,13 @@
         <w:t>Subsequent recordings start recording immediately</w:t>
       </w:r>
       <w:r>
-        <w:t xml:space="preserve"> – reduced latency</w:t>
-      </w:r>
+        <w:t xml:space="preserve"> – reduced </w:t>
+      </w:r>
+      <w:proofErr w:type="gramStart"/>
+      <w:r>
+        <w:t>latency</w:t>
+      </w:r>
+      <w:proofErr w:type="gramEnd"/>
     </w:p>
     <w:p>
       <w:pPr>
@@ -479,8 +484,13 @@
         </w:numPr>
       </w:pPr>
       <w:r>
-        <w:t>Will create an endpoint for video uploads, Lambda provides a temporary private URL that uploads straight to S3 since API gateway has 10MB limit and won’t allow videos</w:t>
-      </w:r>
+        <w:t xml:space="preserve">Will create an endpoint for video uploads, Lambda provides a temporary private URL that uploads straight to S3 since API gateway has 10MB limit and won’t allow </w:t>
+      </w:r>
+      <w:proofErr w:type="gramStart"/>
+      <w:r>
+        <w:t>videos</w:t>
+      </w:r>
+      <w:proofErr w:type="gramEnd"/>
     </w:p>
     <w:p>
       <w:pPr>
@@ -491,8 +501,13 @@
         </w:numPr>
       </w:pPr>
       <w:r>
-        <w:t>Created Lambda serverless file skeleton</w:t>
-      </w:r>
+        <w:t xml:space="preserve">Created Lambda serverless file </w:t>
+      </w:r>
+      <w:proofErr w:type="gramStart"/>
+      <w:r>
+        <w:t>skeleton</w:t>
+      </w:r>
+      <w:proofErr w:type="gramEnd"/>
     </w:p>
     <w:p>
       <w:pPr>
@@ -512,8 +527,13 @@
       </w:r>
       <w:proofErr w:type="spellEnd"/>
       <w:r>
-        <w:t xml:space="preserve"> for video upload</w:t>
-      </w:r>
+        <w:t xml:space="preserve"> for video </w:t>
+      </w:r>
+      <w:proofErr w:type="gramStart"/>
+      <w:r>
+        <w:t>upload</w:t>
+      </w:r>
+      <w:proofErr w:type="gramEnd"/>
     </w:p>
     <w:p>
       <w:pPr>
@@ -660,6 +680,18 @@
       </w:pPr>
       <w:r>
         <w:t>After analyzing the video documentation, NOVA 2 LITE WORKS</w:t>
+      </w:r>
+    </w:p>
+    <w:p>
+      <w:pPr>
+        <w:pStyle w:val="ListParagraph"/>
+        <w:numPr>
+          <w:ilvl w:val="0"/>
+          <w:numId w:val="6"/>
+        </w:numPr>
+      </w:pPr>
+      <w:r>
+        <w:t>No longer using Nova 2 Sonic, it is not good for transcription, too much work when Apple is suffucient</w:t>
       </w:r>
     </w:p>
     <w:sectPr>

</xml_diff>

<commit_message>
logs: API pipeline - iOS to Lambda
</commit_message>
<xml_diff>
--- a/Recon logs.docx
+++ b/Recon logs.docx
@@ -691,7 +691,73 @@
         </w:numPr>
       </w:pPr>
       <w:r>
-        <w:t>No longer using Nova 2 Sonic, it is not good for transcription, too much work when Apple is suffucient</w:t>
+        <w:t xml:space="preserve">No longer using Nova 2 Sonic, it is not good for transcription, too much work when Apple is </w:t>
+      </w:r>
+      <w:proofErr w:type="gramStart"/>
+      <w:r>
+        <w:t>sufficient</w:t>
+      </w:r>
+      <w:proofErr w:type="gramEnd"/>
+    </w:p>
+    <w:p>
+      <w:pPr>
+        <w:rPr>
+          <w:b/>
+          <w:bCs/>
+        </w:rPr>
+      </w:pPr>
+      <w:r>
+        <w:rPr>
+          <w:b/>
+          <w:bCs/>
+        </w:rPr>
+        <w:t>Feb 24, 2026</w:t>
+      </w:r>
+    </w:p>
+    <w:p>
+      <w:pPr>
+        <w:pStyle w:val="ListParagraph"/>
+        <w:numPr>
+          <w:ilvl w:val="0"/>
+          <w:numId w:val="7"/>
+        </w:numPr>
+      </w:pPr>
+      <w:r>
+        <w:t>API config and Incident report for more structured and typed http requests and responses</w:t>
+      </w:r>
+    </w:p>
+    <w:p>
+      <w:pPr>
+        <w:pStyle w:val="ListParagraph"/>
+        <w:numPr>
+          <w:ilvl w:val="0"/>
+          <w:numId w:val="7"/>
+        </w:numPr>
+      </w:pPr>
+      <w:r>
+        <w:t xml:space="preserve">API service contains all the http functions to </w:t>
+      </w:r>
+      <w:proofErr w:type="gramStart"/>
+      <w:r>
+        <w:t>Lambda</w:t>
+      </w:r>
+      <w:proofErr w:type="gramEnd"/>
+    </w:p>
+    <w:p>
+      <w:pPr>
+        <w:pStyle w:val="ListParagraph"/>
+        <w:numPr>
+          <w:ilvl w:val="0"/>
+          <w:numId w:val="7"/>
+        </w:numPr>
+      </w:pPr>
+      <w:proofErr w:type="spellStart"/>
+      <w:r>
+        <w:t>AnalysisViewModel</w:t>
+      </w:r>
+      <w:proofErr w:type="spellEnd"/>
+      <w:r>
+        <w:t xml:space="preserve"> calls all the API services and connects the entire analysis pipeline + updates the UI message for loading during analysis</w:t>
       </w:r>
     </w:p>
     <w:sectPr>
@@ -1369,6 +1435,119 @@
       </w:pPr>
       <w:rPr>
         <w:rFonts w:ascii="Courier New" w:hAnsi="Courier New" w:hint="default"/>
+      </w:rPr>
+    </w:lvl>
+    <w:lvl w:ilvl="8" w:tplc="04090005" w:tentative="1">
+      <w:start w:val="1"/>
+      <w:numFmt w:val="bullet"/>
+      <w:lvlText w:val=""/>
+      <w:lvlJc w:val="left"/>
+      <w:pPr>
+        <w:ind w:left="6480" w:hanging="360"/>
+      </w:pPr>
+      <w:rPr>
+        <w:rFonts w:ascii="Wingdings" w:hAnsi="Wingdings" w:hint="default"/>
+      </w:rPr>
+    </w:lvl>
+  </w:abstractNum>
+  <w:abstractNum w:abstractNumId="6" w15:restartNumberingAfterBreak="0">
+    <w:nsid w:val="72AD149A"/>
+    <w:multiLevelType w:val="hybridMultilevel"/>
+    <w:tmpl w:val="0ED8BA0C"/>
+    <w:lvl w:ilvl="0" w:tplc="04090001">
+      <w:start w:val="1"/>
+      <w:numFmt w:val="bullet"/>
+      <w:lvlText w:val=""/>
+      <w:lvlJc w:val="left"/>
+      <w:pPr>
+        <w:ind w:left="720" w:hanging="360"/>
+      </w:pPr>
+      <w:rPr>
+        <w:rFonts w:ascii="Symbol" w:hAnsi="Symbol" w:hint="default"/>
+      </w:rPr>
+    </w:lvl>
+    <w:lvl w:ilvl="1" w:tplc="04090003" w:tentative="1">
+      <w:start w:val="1"/>
+      <w:numFmt w:val="bullet"/>
+      <w:lvlText w:val="o"/>
+      <w:lvlJc w:val="left"/>
+      <w:pPr>
+        <w:ind w:left="1440" w:hanging="360"/>
+      </w:pPr>
+      <w:rPr>
+        <w:rFonts w:ascii="Courier New" w:hAnsi="Courier New" w:cs="Courier New" w:hint="default"/>
+      </w:rPr>
+    </w:lvl>
+    <w:lvl w:ilvl="2" w:tplc="04090005" w:tentative="1">
+      <w:start w:val="1"/>
+      <w:numFmt w:val="bullet"/>
+      <w:lvlText w:val=""/>
+      <w:lvlJc w:val="left"/>
+      <w:pPr>
+        <w:ind w:left="2160" w:hanging="360"/>
+      </w:pPr>
+      <w:rPr>
+        <w:rFonts w:ascii="Wingdings" w:hAnsi="Wingdings" w:hint="default"/>
+      </w:rPr>
+    </w:lvl>
+    <w:lvl w:ilvl="3" w:tplc="04090001" w:tentative="1">
+      <w:start w:val="1"/>
+      <w:numFmt w:val="bullet"/>
+      <w:lvlText w:val=""/>
+      <w:lvlJc w:val="left"/>
+      <w:pPr>
+        <w:ind w:left="2880" w:hanging="360"/>
+      </w:pPr>
+      <w:rPr>
+        <w:rFonts w:ascii="Symbol" w:hAnsi="Symbol" w:hint="default"/>
+      </w:rPr>
+    </w:lvl>
+    <w:lvl w:ilvl="4" w:tplc="04090003" w:tentative="1">
+      <w:start w:val="1"/>
+      <w:numFmt w:val="bullet"/>
+      <w:lvlText w:val="o"/>
+      <w:lvlJc w:val="left"/>
+      <w:pPr>
+        <w:ind w:left="3600" w:hanging="360"/>
+      </w:pPr>
+      <w:rPr>
+        <w:rFonts w:ascii="Courier New" w:hAnsi="Courier New" w:cs="Courier New" w:hint="default"/>
+      </w:rPr>
+    </w:lvl>
+    <w:lvl w:ilvl="5" w:tplc="04090005" w:tentative="1">
+      <w:start w:val="1"/>
+      <w:numFmt w:val="bullet"/>
+      <w:lvlText w:val=""/>
+      <w:lvlJc w:val="left"/>
+      <w:pPr>
+        <w:ind w:left="4320" w:hanging="360"/>
+      </w:pPr>
+      <w:rPr>
+        <w:rFonts w:ascii="Wingdings" w:hAnsi="Wingdings" w:hint="default"/>
+      </w:rPr>
+    </w:lvl>
+    <w:lvl w:ilvl="6" w:tplc="04090001" w:tentative="1">
+      <w:start w:val="1"/>
+      <w:numFmt w:val="bullet"/>
+      <w:lvlText w:val=""/>
+      <w:lvlJc w:val="left"/>
+      <w:pPr>
+        <w:ind w:left="5040" w:hanging="360"/>
+      </w:pPr>
+      <w:rPr>
+        <w:rFonts w:ascii="Symbol" w:hAnsi="Symbol" w:hint="default"/>
+      </w:rPr>
+    </w:lvl>
+    <w:lvl w:ilvl="7" w:tplc="04090003" w:tentative="1">
+      <w:start w:val="1"/>
+      <w:numFmt w:val="bullet"/>
+      <w:lvlText w:val="o"/>
+      <w:lvlJc w:val="left"/>
+      <w:pPr>
+        <w:ind w:left="5760" w:hanging="360"/>
+      </w:pPr>
+      <w:rPr>
+        <w:rFonts w:ascii="Courier New" w:hAnsi="Courier New" w:cs="Courier New" w:hint="default"/>
       </w:rPr>
     </w:lvl>
     <w:lvl w:ilvl="8" w:tplc="04090005" w:tentative="1">
@@ -1401,6 +1580,9 @@
   </w:num>
   <w:num w:numId="6" w16cid:durableId="1140150217">
     <w:abstractNumId w:val="0"/>
+  </w:num>
+  <w:num w:numId="7" w16cid:durableId="1105341004">
+    <w:abstractNumId w:val="6"/>
   </w:num>
 </w:numbering>
 </file>

</xml_diff>

<commit_message>
full screen video in report
</commit_message>
<xml_diff>
--- a/Recon logs.docx
+++ b/Recon logs.docx
@@ -42,21 +42,8 @@
         </w:numPr>
       </w:pPr>
       <w:r>
-        <w:t xml:space="preserve">Implement the session manager and </w:t>
-      </w:r>
-      <w:proofErr w:type="spellStart"/>
-      <w:r>
-        <w:t>movieOutput</w:t>
-      </w:r>
-      <w:proofErr w:type="spellEnd"/>
-      <w:r>
-        <w:t xml:space="preserve"> for connecting the </w:t>
-      </w:r>
-      <w:proofErr w:type="gramStart"/>
-      <w:r>
-        <w:t>camera</w:t>
-      </w:r>
-      <w:proofErr w:type="gramEnd"/>
+        <w:t>Implement the session manager and movieOutput for connecting the camera</w:t>
+      </w:r>
     </w:p>
     <w:p>
       <w:pPr>
@@ -67,13 +54,8 @@
         </w:numPr>
       </w:pPr>
       <w:r>
-        <w:t xml:space="preserve">Added start and stop recording functions for the camera, update recording </w:t>
-      </w:r>
-      <w:proofErr w:type="gramStart"/>
-      <w:r>
-        <w:t>state</w:t>
-      </w:r>
-      <w:proofErr w:type="gramEnd"/>
+        <w:t>Added start and stop recording functions for the camera, update recording state</w:t>
+      </w:r>
     </w:p>
     <w:p>
       <w:pPr>
@@ -84,13 +66,8 @@
         </w:numPr>
       </w:pPr>
       <w:r>
-        <w:t xml:space="preserve">Tested out camera on iPhone </w:t>
-      </w:r>
-      <w:proofErr w:type="gramStart"/>
-      <w:r>
-        <w:t>15</w:t>
-      </w:r>
-      <w:proofErr w:type="gramEnd"/>
+        <w:t>Tested out camera on iPhone 15</w:t>
+      </w:r>
     </w:p>
     <w:p>
       <w:pPr>
@@ -101,21 +78,8 @@
         </w:numPr>
       </w:pPr>
       <w:r>
-        <w:t xml:space="preserve">Initially was a blank screen, no camera view because video player got a zero frame since </w:t>
-      </w:r>
-      <w:proofErr w:type="spellStart"/>
-      <w:r>
-        <w:t>UIView</w:t>
-      </w:r>
-      <w:proofErr w:type="spellEnd"/>
-      <w:r>
-        <w:t xml:space="preserve"> is defaulted to a size of 0, and then we attach the camera on top before resizing. Now, then camera player is the view’s </w:t>
-      </w:r>
-      <w:proofErr w:type="gramStart"/>
-      <w:r>
-        <w:t>layer</w:t>
-      </w:r>
-      <w:proofErr w:type="gramEnd"/>
+        <w:t>Initially was a blank screen, no camera view because video player got a zero frame since UIView is defaulted to a size of 0, and then we attach the camera on top before resizing. Now, then camera player is the view’s layer</w:t>
+      </w:r>
     </w:p>
     <w:p>
       <w:pPr>
@@ -126,13 +90,8 @@
         </w:numPr>
       </w:pPr>
       <w:r>
-        <w:t xml:space="preserve">Video gets saved to phone app’s private </w:t>
-      </w:r>
-      <w:proofErr w:type="gramStart"/>
-      <w:r>
-        <w:t>sandbox</w:t>
-      </w:r>
-      <w:proofErr w:type="gramEnd"/>
+        <w:t>Video gets saved to phone app’s private sandbox</w:t>
+      </w:r>
     </w:p>
     <w:p>
       <w:pPr>
@@ -155,29 +114,11 @@
         </w:numPr>
       </w:pPr>
       <w:r>
-        <w:t xml:space="preserve">Change </w:t>
-      </w:r>
-      <w:proofErr w:type="spellStart"/>
-      <w:r>
-        <w:t>AVCaptureSession</w:t>
-      </w:r>
-      <w:proofErr w:type="spellEnd"/>
-      <w:r>
-        <w:t xml:space="preserve"> to </w:t>
-      </w:r>
-      <w:proofErr w:type="spellStart"/>
-      <w:r>
-        <w:t>AVCaptureMultiCamSession</w:t>
-      </w:r>
-      <w:proofErr w:type="spellEnd"/>
-      <w:r>
-        <w:t xml:space="preserve"> to accept multiple camera </w:t>
-      </w:r>
-      <w:proofErr w:type="gramStart"/>
-      <w:r>
-        <w:t>inputs</w:t>
-      </w:r>
-      <w:proofErr w:type="gramEnd"/>
+        <w:t>Change AVCaptureSession to AVCaptureMultiCamSession</w:t>
+      </w:r>
+      <w:r>
+        <w:t xml:space="preserve"> to accept multiple camera inputs</w:t>
+      </w:r>
     </w:p>
     <w:p>
       <w:pPr>
@@ -187,35 +128,9 @@
           <w:numId w:val="2"/>
         </w:numPr>
       </w:pPr>
-      <w:proofErr w:type="spellStart"/>
-      <w:r>
-        <w:t>AVCaptureVideoDataOutput</w:t>
-      </w:r>
-      <w:proofErr w:type="spellEnd"/>
-      <w:r>
-        <w:t xml:space="preserve"> instead of </w:t>
-      </w:r>
-      <w:proofErr w:type="spellStart"/>
-      <w:r>
-        <w:t>movieOutput</w:t>
-      </w:r>
-      <w:proofErr w:type="spellEnd"/>
-      <w:r>
-        <w:t xml:space="preserve"> (</w:t>
-      </w:r>
-      <w:proofErr w:type="spellStart"/>
-      <w:r>
-        <w:t>AVCaptureMovieFileOutput</w:t>
-      </w:r>
-      <w:proofErr w:type="spellEnd"/>
-      <w:r>
-        <w:t xml:space="preserve">) so you can modify raw video frames and composite them before saving, rather than writing directly to a </w:t>
-      </w:r>
-      <w:proofErr w:type="gramStart"/>
-      <w:r>
-        <w:t>file</w:t>
-      </w:r>
-      <w:proofErr w:type="gramEnd"/>
+      <w:r>
+        <w:t>AVCaptureVideoDataOutput instead of movieOutput (AVCaptureMovieFileOutput) so you can modify raw video frames and composite them before saving, rather than writing directly to a file</w:t>
+      </w:r>
     </w:p>
     <w:p>
       <w:pPr>
@@ -226,13 +141,8 @@
         </w:numPr>
       </w:pPr>
       <w:r>
-        <w:t xml:space="preserve">Video compositor to take two frames (front and back), shrink the front to take up the </w:t>
-      </w:r>
-      <w:proofErr w:type="gramStart"/>
-      <w:r>
-        <w:t>corner</w:t>
-      </w:r>
-      <w:proofErr w:type="gramEnd"/>
+        <w:t>Video compositor to take two frames (front and back), shrink the front to take up the corner</w:t>
+      </w:r>
     </w:p>
     <w:p>
       <w:pPr>
@@ -242,13 +152,8 @@
           <w:numId w:val="2"/>
         </w:numPr>
       </w:pPr>
-      <w:proofErr w:type="spellStart"/>
-      <w:r>
-        <w:t>AVAssetWriter</w:t>
-      </w:r>
-      <w:proofErr w:type="spellEnd"/>
-      <w:r>
-        <w:t>, feed it individual frames and audio samples and it’ll write it to a .mov</w:t>
+      <w:r>
+        <w:t>AVAssetWriter, feed it individual frames and audio samples and it’ll write it to a .mov</w:t>
       </w:r>
     </w:p>
     <w:p>
@@ -278,13 +183,8 @@
         <w:t>Made GPS manager</w:t>
       </w:r>
       <w:r>
-        <w:t xml:space="preserve">, which asks for location permissions and updates location, start + stop location </w:t>
-      </w:r>
-      <w:proofErr w:type="gramStart"/>
-      <w:r>
-        <w:t>tracking</w:t>
-      </w:r>
-      <w:proofErr w:type="gramEnd"/>
+        <w:t>, which asks for location permissions and updates location, start + stop location tracking</w:t>
+      </w:r>
     </w:p>
     <w:p>
       <w:pPr>
@@ -295,13 +195,8 @@
         </w:numPr>
       </w:pPr>
       <w:r>
-        <w:t xml:space="preserve">Made Video compositor, which takes in front and back camera frame by frame images and overlays them into another frame image, with front 25% in corner on top of </w:t>
-      </w:r>
-      <w:proofErr w:type="gramStart"/>
-      <w:r>
-        <w:t>back</w:t>
-      </w:r>
-      <w:proofErr w:type="gramEnd"/>
+        <w:t>Made Video compositor, which takes in front and back camera frame by frame images and overlays them into another frame image, with front 25% in corner on top of back</w:t>
+      </w:r>
     </w:p>
     <w:p>
       <w:pPr>
@@ -342,21 +237,8 @@
         </w:numPr>
       </w:pPr>
       <w:r>
-        <w:t xml:space="preserve">Fixed the front camera overlay to be rounded and in the corner by scaling it to 25% size and translating it to the corner. Shrink first, then reset origin to not mess up positioning. To create the rounded frame, first create a white rounded rectangle, convert to </w:t>
-      </w:r>
-      <w:proofErr w:type="spellStart"/>
-      <w:r>
-        <w:t>CIImage</w:t>
-      </w:r>
-      <w:proofErr w:type="spellEnd"/>
-      <w:r>
-        <w:t xml:space="preserve"> and position it over the front frame, so that only the parts of the camera in white are shown, rest is </w:t>
-      </w:r>
-      <w:proofErr w:type="gramStart"/>
-      <w:r>
-        <w:t>invisible</w:t>
-      </w:r>
-      <w:proofErr w:type="gramEnd"/>
+        <w:t>Fixed the front camera overlay to be rounded and in the corner by scaling it to 25% size and translating it to the corner. Shrink first, then reset origin to not mess up positioning. To create the rounded frame, first create a white rounded rectangle, convert to CIImage and position it over the front frame, so that only the parts of the camera in white are shown, rest is invisible</w:t>
+      </w:r>
     </w:p>
     <w:p>
       <w:pPr>
@@ -367,29 +249,8 @@
         </w:numPr>
       </w:pPr>
       <w:r>
-        <w:t xml:space="preserve">Draw timestamp as </w:t>
-      </w:r>
-      <w:proofErr w:type="spellStart"/>
-      <w:r>
-        <w:t>UIImage</w:t>
-      </w:r>
-      <w:proofErr w:type="spellEnd"/>
-      <w:r>
-        <w:t xml:space="preserve"> and place convert to </w:t>
-      </w:r>
-      <w:proofErr w:type="spellStart"/>
-      <w:r>
-        <w:t>CIImage</w:t>
-      </w:r>
-      <w:proofErr w:type="spellEnd"/>
-      <w:r>
-        <w:t xml:space="preserve">, position over </w:t>
-      </w:r>
-      <w:proofErr w:type="gramStart"/>
-      <w:r>
-        <w:t>video</w:t>
-      </w:r>
-      <w:proofErr w:type="gramEnd"/>
+        <w:t>Draw timestamp as UIImage and place convert to CIImage, position over video</w:t>
+      </w:r>
     </w:p>
     <w:p>
       <w:pPr>
@@ -415,15 +276,7 @@
         </w:numPr>
       </w:pPr>
       <w:r>
-        <w:t xml:space="preserve">Learning about Queues and background thread, Swift has multiple background threads and one main thread, and you can have asynchronous tasks on each thread. But each asynchronous task gets put into a </w:t>
-      </w:r>
-      <w:proofErr w:type="gramStart"/>
-      <w:r>
-        <w:t>Queue</w:t>
-      </w:r>
-      <w:proofErr w:type="gramEnd"/>
-      <w:r>
-        <w:t xml:space="preserve"> so the asynchronous tasks are asynchronous with the synchronous tasks, but all the asynchronous tasks are synchronous with each other and form a Queue. You can put them all in different background threads to be fully parallel. You can also name a Queue to serialize them and put certain services into the same thread if you wish them to execute in order when they depend on each other.</w:t>
+        <w:t>Learning about Queues and background thread, Swift has multiple background threads and one main thread, and you can have asynchronous tasks on each thread. But each asynchronous task gets put into a Queue so the asynchronous tasks are asynchronous with the synchronous tasks, but all the asynchronous tasks are synchronous with each other and form a Queue. You can put them all in different background threads to be fully parallel. You can also name a Queue to serialize them and put certain services into the same thread if you wish them to execute in order when they depend on each other.</w:t>
       </w:r>
     </w:p>
     <w:p>
@@ -435,13 +288,8 @@
         </w:numPr>
       </w:pPr>
       <w:r>
-        <w:t xml:space="preserve">Fixed transcript reset so it works on subsequent </w:t>
-      </w:r>
-      <w:proofErr w:type="gramStart"/>
-      <w:r>
-        <w:t>recordings</w:t>
-      </w:r>
-      <w:proofErr w:type="gramEnd"/>
+        <w:t>Fixed transcript reset so it works on subsequent recordings</w:t>
+      </w:r>
     </w:p>
     <w:p>
       <w:pPr>
@@ -455,13 +303,8 @@
         <w:t>Subsequent recordings start recording immediately</w:t>
       </w:r>
       <w:r>
-        <w:t xml:space="preserve"> – reduced </w:t>
-      </w:r>
-      <w:proofErr w:type="gramStart"/>
-      <w:r>
-        <w:t>latency</w:t>
-      </w:r>
-      <w:proofErr w:type="gramEnd"/>
+        <w:t xml:space="preserve"> – reduced latency</w:t>
+      </w:r>
     </w:p>
     <w:p>
       <w:pPr>
@@ -484,13 +327,8 @@
         </w:numPr>
       </w:pPr>
       <w:r>
-        <w:t xml:space="preserve">Will create an endpoint for video uploads, Lambda provides a temporary private URL that uploads straight to S3 since API gateway has 10MB limit and won’t allow </w:t>
-      </w:r>
-      <w:proofErr w:type="gramStart"/>
-      <w:r>
-        <w:t>videos</w:t>
-      </w:r>
-      <w:proofErr w:type="gramEnd"/>
+        <w:t>Will create an endpoint for video uploads, Lambda provides a temporary private URL that uploads straight to S3 since API gateway has 10MB limit and won’t allow videos</w:t>
+      </w:r>
     </w:p>
     <w:p>
       <w:pPr>
@@ -501,13 +339,8 @@
         </w:numPr>
       </w:pPr>
       <w:r>
-        <w:t xml:space="preserve">Created Lambda serverless file </w:t>
-      </w:r>
-      <w:proofErr w:type="gramStart"/>
-      <w:r>
-        <w:t>skeleton</w:t>
-      </w:r>
-      <w:proofErr w:type="gramEnd"/>
+        <w:t>Created Lambda serverless file skeleton</w:t>
+      </w:r>
     </w:p>
     <w:p>
       <w:pPr>
@@ -519,21 +352,8 @@
       </w:pPr>
       <w:r>
         <w:lastRenderedPageBreak/>
-        <w:t xml:space="preserve">Generate temporary </w:t>
-      </w:r>
-      <w:proofErr w:type="spellStart"/>
-      <w:r>
-        <w:t>url</w:t>
-      </w:r>
-      <w:proofErr w:type="spellEnd"/>
-      <w:r>
-        <w:t xml:space="preserve"> for video </w:t>
-      </w:r>
-      <w:proofErr w:type="gramStart"/>
-      <w:r>
-        <w:t>upload</w:t>
-      </w:r>
-      <w:proofErr w:type="gramEnd"/>
+        <w:t>Generate temporary url for video upload</w:t>
+      </w:r>
     </w:p>
     <w:p>
       <w:pPr>
@@ -559,15 +379,7 @@
         </w:numPr>
       </w:pPr>
       <w:r>
-        <w:t xml:space="preserve">Set up AWS </w:t>
-      </w:r>
-      <w:proofErr w:type="spellStart"/>
-      <w:r>
-        <w:t>presigning</w:t>
-      </w:r>
-      <w:proofErr w:type="spellEnd"/>
-      <w:r>
-        <w:t xml:space="preserve"> URL</w:t>
+        <w:t>Set up AWS presigning URL</w:t>
       </w:r>
       <w:r>
         <w:t xml:space="preserve"> for S3 bucket</w:t>
@@ -597,15 +409,7 @@
         </w:numPr>
       </w:pPr>
       <w:r>
-        <w:t xml:space="preserve">Amazon Bedrock doesn’t work and has significant rate limit issues, switching to </w:t>
-      </w:r>
-      <w:proofErr w:type="spellStart"/>
-      <w:r>
-        <w:t>OpenAI</w:t>
-      </w:r>
-      <w:proofErr w:type="spellEnd"/>
-      <w:r>
-        <w:t xml:space="preserve"> SDK to call Nova directly, bypassing the rate limit</w:t>
+        <w:t>Amazon Bedrock doesn’t work and has significant rate limit issues, switching to OpenAI SDK to call Nova directly, bypassing the rate limit</w:t>
       </w:r>
     </w:p>
     <w:p>
@@ -617,13 +421,8 @@
         </w:numPr>
       </w:pPr>
       <w:r>
-        <w:t xml:space="preserve">Added Lambda layer for open ai </w:t>
-      </w:r>
-      <w:proofErr w:type="spellStart"/>
-      <w:r>
-        <w:t>sdk</w:t>
-      </w:r>
-      <w:proofErr w:type="spellEnd"/>
+        <w:t>Added Lambda layer for open ai sdk</w:t>
+      </w:r>
     </w:p>
     <w:p>
       <w:pPr>
@@ -633,21 +432,8 @@
           <w:numId w:val="6"/>
         </w:numPr>
       </w:pPr>
-      <w:proofErr w:type="spellStart"/>
-      <w:r>
-        <w:t>OpenAI</w:t>
-      </w:r>
-      <w:proofErr w:type="spellEnd"/>
-      <w:r>
-        <w:t xml:space="preserve"> package depends on </w:t>
-      </w:r>
-      <w:proofErr w:type="spellStart"/>
-      <w:r>
-        <w:t>pydantic</w:t>
-      </w:r>
-      <w:proofErr w:type="spellEnd"/>
-      <w:r>
-        <w:t xml:space="preserve"> which is written in C/Rust. Pip install on Mac downloads binaries compiled for arm64, whereas Lambda runs on Amazon Linux</w:t>
+      <w:r>
+        <w:t>OpenAI package depends on pydantic which is written in C/Rust. Pip install on Mac downloads binaries compiled for arm64, whereas Lambda runs on Amazon Linux</w:t>
       </w:r>
     </w:p>
     <w:p>
@@ -659,15 +445,7 @@
         </w:numPr>
       </w:pPr>
       <w:r>
-        <w:t xml:space="preserve">Ran a Docker container to install and zip the python </w:t>
-      </w:r>
-      <w:proofErr w:type="spellStart"/>
-      <w:r>
-        <w:t>sdk</w:t>
-      </w:r>
-      <w:proofErr w:type="spellEnd"/>
-      <w:r>
-        <w:t xml:space="preserve"> in Linux, then uploaded to Lambda</w:t>
+        <w:t>Ran a Docker container to install and zip the python sdk in Linux, then uploaded to Lambda</w:t>
       </w:r>
     </w:p>
     <w:p>
@@ -693,11 +471,9 @@
       <w:r>
         <w:t xml:space="preserve">No longer using Nova 2 Sonic, it is not good for transcription, too much work when Apple is </w:t>
       </w:r>
-      <w:proofErr w:type="gramStart"/>
       <w:r>
         <w:t>sufficient</w:t>
       </w:r>
-      <w:proofErr w:type="gramEnd"/>
     </w:p>
     <w:p>
       <w:pPr>
@@ -735,13 +511,8 @@
         </w:numPr>
       </w:pPr>
       <w:r>
-        <w:t xml:space="preserve">API service contains all the http functions to </w:t>
-      </w:r>
-      <w:proofErr w:type="gramStart"/>
-      <w:r>
-        <w:t>Lambda</w:t>
-      </w:r>
-      <w:proofErr w:type="gramEnd"/>
+        <w:t>API service contains all the http functions to Lambda</w:t>
+      </w:r>
     </w:p>
     <w:p>
       <w:pPr>
@@ -751,13 +522,59 @@
           <w:numId w:val="7"/>
         </w:numPr>
       </w:pPr>
-      <w:proofErr w:type="spellStart"/>
-      <w:r>
-        <w:t>AnalysisViewModel</w:t>
-      </w:r>
-      <w:proofErr w:type="spellEnd"/>
-      <w:r>
-        <w:t xml:space="preserve"> calls all the API services and connects the entire analysis pipeline + updates the UI message for loading during analysis</w:t>
+      <w:r>
+        <w:t>AnalysisViewModel calls all the API services and connects the entire analysis pipeline + updates the UI message for loading during analysis</w:t>
+      </w:r>
+    </w:p>
+    <w:p>
+      <w:pPr>
+        <w:rPr>
+          <w:b/>
+          <w:bCs/>
+        </w:rPr>
+      </w:pPr>
+      <w:r>
+        <w:rPr>
+          <w:b/>
+          <w:bCs/>
+        </w:rPr>
+        <w:t>Feb 25, 2026</w:t>
+      </w:r>
+    </w:p>
+    <w:p>
+      <w:pPr>
+        <w:pStyle w:val="ListParagraph"/>
+        <w:numPr>
+          <w:ilvl w:val="0"/>
+          <w:numId w:val="8"/>
+        </w:numPr>
+      </w:pPr>
+      <w:r>
+        <w:t>Made UI for loading, analysis, reports, different tab views</w:t>
+      </w:r>
+    </w:p>
+    <w:p>
+      <w:pPr>
+        <w:pStyle w:val="ListParagraph"/>
+        <w:numPr>
+          <w:ilvl w:val="0"/>
+          <w:numId w:val="8"/>
+        </w:numPr>
+      </w:pPr>
+      <w:r>
+        <w:t>Fixed deletion of reports locally, since before it would generate a new uuid for each report everytime they were opened</w:t>
+      </w:r>
+    </w:p>
+    <w:p>
+      <w:pPr>
+        <w:pStyle w:val="ListParagraph"/>
+        <w:numPr>
+          <w:ilvl w:val="0"/>
+          <w:numId w:val="8"/>
+        </w:numPr>
+      </w:pPr>
+      <w:r>
+        <w:t>Add video locally to report</w:t>
       </w:r>
     </w:p>
     <w:sectPr>
@@ -1225,6 +1042,119 @@
     </w:lvl>
   </w:abstractNum>
   <w:abstractNum w:abstractNumId="4" w15:restartNumberingAfterBreak="0">
+    <w:nsid w:val="37ED4650"/>
+    <w:multiLevelType w:val="hybridMultilevel"/>
+    <w:tmpl w:val="60B46E30"/>
+    <w:lvl w:ilvl="0" w:tplc="04090001">
+      <w:start w:val="1"/>
+      <w:numFmt w:val="bullet"/>
+      <w:lvlText w:val=""/>
+      <w:lvlJc w:val="left"/>
+      <w:pPr>
+        <w:ind w:left="720" w:hanging="360"/>
+      </w:pPr>
+      <w:rPr>
+        <w:rFonts w:ascii="Symbol" w:hAnsi="Symbol" w:hint="default"/>
+      </w:rPr>
+    </w:lvl>
+    <w:lvl w:ilvl="1" w:tplc="04090003" w:tentative="1">
+      <w:start w:val="1"/>
+      <w:numFmt w:val="bullet"/>
+      <w:lvlText w:val="o"/>
+      <w:lvlJc w:val="left"/>
+      <w:pPr>
+        <w:ind w:left="1440" w:hanging="360"/>
+      </w:pPr>
+      <w:rPr>
+        <w:rFonts w:ascii="Courier New" w:hAnsi="Courier New" w:cs="Courier New" w:hint="default"/>
+      </w:rPr>
+    </w:lvl>
+    <w:lvl w:ilvl="2" w:tplc="04090005" w:tentative="1">
+      <w:start w:val="1"/>
+      <w:numFmt w:val="bullet"/>
+      <w:lvlText w:val=""/>
+      <w:lvlJc w:val="left"/>
+      <w:pPr>
+        <w:ind w:left="2160" w:hanging="360"/>
+      </w:pPr>
+      <w:rPr>
+        <w:rFonts w:ascii="Wingdings" w:hAnsi="Wingdings" w:hint="default"/>
+      </w:rPr>
+    </w:lvl>
+    <w:lvl w:ilvl="3" w:tplc="04090001" w:tentative="1">
+      <w:start w:val="1"/>
+      <w:numFmt w:val="bullet"/>
+      <w:lvlText w:val=""/>
+      <w:lvlJc w:val="left"/>
+      <w:pPr>
+        <w:ind w:left="2880" w:hanging="360"/>
+      </w:pPr>
+      <w:rPr>
+        <w:rFonts w:ascii="Symbol" w:hAnsi="Symbol" w:hint="default"/>
+      </w:rPr>
+    </w:lvl>
+    <w:lvl w:ilvl="4" w:tplc="04090003" w:tentative="1">
+      <w:start w:val="1"/>
+      <w:numFmt w:val="bullet"/>
+      <w:lvlText w:val="o"/>
+      <w:lvlJc w:val="left"/>
+      <w:pPr>
+        <w:ind w:left="3600" w:hanging="360"/>
+      </w:pPr>
+      <w:rPr>
+        <w:rFonts w:ascii="Courier New" w:hAnsi="Courier New" w:cs="Courier New" w:hint="default"/>
+      </w:rPr>
+    </w:lvl>
+    <w:lvl w:ilvl="5" w:tplc="04090005" w:tentative="1">
+      <w:start w:val="1"/>
+      <w:numFmt w:val="bullet"/>
+      <w:lvlText w:val=""/>
+      <w:lvlJc w:val="left"/>
+      <w:pPr>
+        <w:ind w:left="4320" w:hanging="360"/>
+      </w:pPr>
+      <w:rPr>
+        <w:rFonts w:ascii="Wingdings" w:hAnsi="Wingdings" w:hint="default"/>
+      </w:rPr>
+    </w:lvl>
+    <w:lvl w:ilvl="6" w:tplc="04090001" w:tentative="1">
+      <w:start w:val="1"/>
+      <w:numFmt w:val="bullet"/>
+      <w:lvlText w:val=""/>
+      <w:lvlJc w:val="left"/>
+      <w:pPr>
+        <w:ind w:left="5040" w:hanging="360"/>
+      </w:pPr>
+      <w:rPr>
+        <w:rFonts w:ascii="Symbol" w:hAnsi="Symbol" w:hint="default"/>
+      </w:rPr>
+    </w:lvl>
+    <w:lvl w:ilvl="7" w:tplc="04090003" w:tentative="1">
+      <w:start w:val="1"/>
+      <w:numFmt w:val="bullet"/>
+      <w:lvlText w:val="o"/>
+      <w:lvlJc w:val="left"/>
+      <w:pPr>
+        <w:ind w:left="5760" w:hanging="360"/>
+      </w:pPr>
+      <w:rPr>
+        <w:rFonts w:ascii="Courier New" w:hAnsi="Courier New" w:cs="Courier New" w:hint="default"/>
+      </w:rPr>
+    </w:lvl>
+    <w:lvl w:ilvl="8" w:tplc="04090005" w:tentative="1">
+      <w:start w:val="1"/>
+      <w:numFmt w:val="bullet"/>
+      <w:lvlText w:val=""/>
+      <w:lvlJc w:val="left"/>
+      <w:pPr>
+        <w:ind w:left="6480" w:hanging="360"/>
+      </w:pPr>
+      <w:rPr>
+        <w:rFonts w:ascii="Wingdings" w:hAnsi="Wingdings" w:hint="default"/>
+      </w:rPr>
+    </w:lvl>
+  </w:abstractNum>
+  <w:abstractNum w:abstractNumId="5" w15:restartNumberingAfterBreak="0">
     <w:nsid w:val="5D233F80"/>
     <w:multiLevelType w:val="hybridMultilevel"/>
     <w:tmpl w:val="B5B2EF32"/>
@@ -1337,7 +1267,7 @@
       </w:rPr>
     </w:lvl>
   </w:abstractNum>
-  <w:abstractNum w:abstractNumId="5" w15:restartNumberingAfterBreak="0">
+  <w:abstractNum w:abstractNumId="6" w15:restartNumberingAfterBreak="0">
     <w:nsid w:val="6EE05CBE"/>
     <w:multiLevelType w:val="hybridMultilevel"/>
     <w:tmpl w:val="515E1B30"/>
@@ -1450,7 +1380,7 @@
       </w:rPr>
     </w:lvl>
   </w:abstractNum>
-  <w:abstractNum w:abstractNumId="6" w15:restartNumberingAfterBreak="0">
+  <w:abstractNum w:abstractNumId="7" w15:restartNumberingAfterBreak="0">
     <w:nsid w:val="72AD149A"/>
     <w:multiLevelType w:val="hybridMultilevel"/>
     <w:tmpl w:val="0ED8BA0C"/>
@@ -1567,10 +1497,10 @@
     <w:abstractNumId w:val="1"/>
   </w:num>
   <w:num w:numId="2" w16cid:durableId="1065492894">
-    <w:abstractNumId w:val="5"/>
+    <w:abstractNumId w:val="6"/>
   </w:num>
   <w:num w:numId="3" w16cid:durableId="1901019889">
-    <w:abstractNumId w:val="4"/>
+    <w:abstractNumId w:val="5"/>
   </w:num>
   <w:num w:numId="4" w16cid:durableId="452483282">
     <w:abstractNumId w:val="3"/>
@@ -1582,7 +1512,10 @@
     <w:abstractNumId w:val="0"/>
   </w:num>
   <w:num w:numId="7" w16cid:durableId="1105341004">
-    <w:abstractNumId w:val="6"/>
+    <w:abstractNumId w:val="7"/>
+  </w:num>
+  <w:num w:numId="8" w16cid:durableId="1869566375">
+    <w:abstractNumId w:val="4"/>
   </w:num>
 </w:numbering>
 </file>

</xml_diff>

<commit_message>
on-device Apple transcription selected - Nova can understand other languages
</commit_message>
<xml_diff>
--- a/Recon logs.docx
+++ b/Recon logs.docx
@@ -42,8 +42,21 @@
         </w:numPr>
       </w:pPr>
       <w:r>
-        <w:t>Implement the session manager and movieOutput for connecting the camera</w:t>
-      </w:r>
+        <w:t xml:space="preserve">Implement the session manager and </w:t>
+      </w:r>
+      <w:proofErr w:type="spellStart"/>
+      <w:r>
+        <w:t>movieOutput</w:t>
+      </w:r>
+      <w:proofErr w:type="spellEnd"/>
+      <w:r>
+        <w:t xml:space="preserve"> for connecting the </w:t>
+      </w:r>
+      <w:proofErr w:type="gramStart"/>
+      <w:r>
+        <w:t>camera</w:t>
+      </w:r>
+      <w:proofErr w:type="gramEnd"/>
     </w:p>
     <w:p>
       <w:pPr>
@@ -54,8 +67,13 @@
         </w:numPr>
       </w:pPr>
       <w:r>
-        <w:t>Added start and stop recording functions for the camera, update recording state</w:t>
-      </w:r>
+        <w:t xml:space="preserve">Added start and stop recording functions for the camera, update recording </w:t>
+      </w:r>
+      <w:proofErr w:type="gramStart"/>
+      <w:r>
+        <w:t>state</w:t>
+      </w:r>
+      <w:proofErr w:type="gramEnd"/>
     </w:p>
     <w:p>
       <w:pPr>
@@ -66,8 +84,13 @@
         </w:numPr>
       </w:pPr>
       <w:r>
-        <w:t>Tested out camera on iPhone 15</w:t>
-      </w:r>
+        <w:t xml:space="preserve">Tested out camera on iPhone </w:t>
+      </w:r>
+      <w:proofErr w:type="gramStart"/>
+      <w:r>
+        <w:t>15</w:t>
+      </w:r>
+      <w:proofErr w:type="gramEnd"/>
     </w:p>
     <w:p>
       <w:pPr>
@@ -78,8 +101,21 @@
         </w:numPr>
       </w:pPr>
       <w:r>
-        <w:t>Initially was a blank screen, no camera view because video player got a zero frame since UIView is defaulted to a size of 0, and then we attach the camera on top before resizing. Now, then camera player is the view’s layer</w:t>
-      </w:r>
+        <w:t xml:space="preserve">Initially was a blank screen, no camera view because video player got a zero frame since </w:t>
+      </w:r>
+      <w:proofErr w:type="spellStart"/>
+      <w:r>
+        <w:t>UIView</w:t>
+      </w:r>
+      <w:proofErr w:type="spellEnd"/>
+      <w:r>
+        <w:t xml:space="preserve"> is defaulted to a size of 0, and then we attach the camera on top before resizing. Now, then camera player is the view’s </w:t>
+      </w:r>
+      <w:proofErr w:type="gramStart"/>
+      <w:r>
+        <w:t>layer</w:t>
+      </w:r>
+      <w:proofErr w:type="gramEnd"/>
     </w:p>
     <w:p>
       <w:pPr>
@@ -90,8 +126,13 @@
         </w:numPr>
       </w:pPr>
       <w:r>
-        <w:t>Video gets saved to phone app’s private sandbox</w:t>
-      </w:r>
+        <w:t xml:space="preserve">Video gets saved to phone app’s private </w:t>
+      </w:r>
+      <w:proofErr w:type="gramStart"/>
+      <w:r>
+        <w:t>sandbox</w:t>
+      </w:r>
+      <w:proofErr w:type="gramEnd"/>
     </w:p>
     <w:p>
       <w:pPr>
@@ -114,11 +155,29 @@
         </w:numPr>
       </w:pPr>
       <w:r>
-        <w:t>Change AVCaptureSession to AVCaptureMultiCamSession</w:t>
-      </w:r>
-      <w:r>
-        <w:t xml:space="preserve"> to accept multiple camera inputs</w:t>
-      </w:r>
+        <w:t xml:space="preserve">Change </w:t>
+      </w:r>
+      <w:proofErr w:type="spellStart"/>
+      <w:r>
+        <w:t>AVCaptureSession</w:t>
+      </w:r>
+      <w:proofErr w:type="spellEnd"/>
+      <w:r>
+        <w:t xml:space="preserve"> to </w:t>
+      </w:r>
+      <w:proofErr w:type="spellStart"/>
+      <w:r>
+        <w:t>AVCaptureMultiCamSession</w:t>
+      </w:r>
+      <w:proofErr w:type="spellEnd"/>
+      <w:r>
+        <w:t xml:space="preserve"> to accept multiple camera </w:t>
+      </w:r>
+      <w:proofErr w:type="gramStart"/>
+      <w:r>
+        <w:t>inputs</w:t>
+      </w:r>
+      <w:proofErr w:type="gramEnd"/>
     </w:p>
     <w:p>
       <w:pPr>
@@ -128,9 +187,35 @@
           <w:numId w:val="2"/>
         </w:numPr>
       </w:pPr>
-      <w:r>
-        <w:t>AVCaptureVideoDataOutput instead of movieOutput (AVCaptureMovieFileOutput) so you can modify raw video frames and composite them before saving, rather than writing directly to a file</w:t>
-      </w:r>
+      <w:proofErr w:type="spellStart"/>
+      <w:r>
+        <w:t>AVCaptureVideoDataOutput</w:t>
+      </w:r>
+      <w:proofErr w:type="spellEnd"/>
+      <w:r>
+        <w:t xml:space="preserve"> instead of </w:t>
+      </w:r>
+      <w:proofErr w:type="spellStart"/>
+      <w:r>
+        <w:t>movieOutput</w:t>
+      </w:r>
+      <w:proofErr w:type="spellEnd"/>
+      <w:r>
+        <w:t xml:space="preserve"> (</w:t>
+      </w:r>
+      <w:proofErr w:type="spellStart"/>
+      <w:r>
+        <w:t>AVCaptureMovieFileOutput</w:t>
+      </w:r>
+      <w:proofErr w:type="spellEnd"/>
+      <w:r>
+        <w:t xml:space="preserve">) so you can modify raw video frames and composite them before saving, rather than writing directly to a </w:t>
+      </w:r>
+      <w:proofErr w:type="gramStart"/>
+      <w:r>
+        <w:t>file</w:t>
+      </w:r>
+      <w:proofErr w:type="gramEnd"/>
     </w:p>
     <w:p>
       <w:pPr>
@@ -141,8 +226,13 @@
         </w:numPr>
       </w:pPr>
       <w:r>
-        <w:t>Video compositor to take two frames (front and back), shrink the front to take up the corner</w:t>
-      </w:r>
+        <w:t xml:space="preserve">Video compositor to take two frames (front and back), shrink the front to take up the </w:t>
+      </w:r>
+      <w:proofErr w:type="gramStart"/>
+      <w:r>
+        <w:t>corner</w:t>
+      </w:r>
+      <w:proofErr w:type="gramEnd"/>
     </w:p>
     <w:p>
       <w:pPr>
@@ -152,8 +242,13 @@
           <w:numId w:val="2"/>
         </w:numPr>
       </w:pPr>
-      <w:r>
-        <w:t>AVAssetWriter, feed it individual frames and audio samples and it’ll write it to a .mov</w:t>
+      <w:proofErr w:type="spellStart"/>
+      <w:r>
+        <w:t>AVAssetWriter</w:t>
+      </w:r>
+      <w:proofErr w:type="spellEnd"/>
+      <w:r>
+        <w:t>, feed it individual frames and audio samples and it’ll write it to a .mov</w:t>
       </w:r>
     </w:p>
     <w:p>
@@ -183,8 +278,13 @@
         <w:t>Made GPS manager</w:t>
       </w:r>
       <w:r>
-        <w:t>, which asks for location permissions and updates location, start + stop location tracking</w:t>
-      </w:r>
+        <w:t xml:space="preserve">, which asks for location permissions and updates location, start + stop location </w:t>
+      </w:r>
+      <w:proofErr w:type="gramStart"/>
+      <w:r>
+        <w:t>tracking</w:t>
+      </w:r>
+      <w:proofErr w:type="gramEnd"/>
     </w:p>
     <w:p>
       <w:pPr>
@@ -195,8 +295,13 @@
         </w:numPr>
       </w:pPr>
       <w:r>
-        <w:t>Made Video compositor, which takes in front and back camera frame by frame images and overlays them into another frame image, with front 25% in corner on top of back</w:t>
-      </w:r>
+        <w:t xml:space="preserve">Made Video compositor, which takes in front and back camera frame by frame images and overlays them into another frame image, with front 25% in corner on top of </w:t>
+      </w:r>
+      <w:proofErr w:type="gramStart"/>
+      <w:r>
+        <w:t>back</w:t>
+      </w:r>
+      <w:proofErr w:type="gramEnd"/>
     </w:p>
     <w:p>
       <w:pPr>
@@ -237,8 +342,21 @@
         </w:numPr>
       </w:pPr>
       <w:r>
-        <w:t>Fixed the front camera overlay to be rounded and in the corner by scaling it to 25% size and translating it to the corner. Shrink first, then reset origin to not mess up positioning. To create the rounded frame, first create a white rounded rectangle, convert to CIImage and position it over the front frame, so that only the parts of the camera in white are shown, rest is invisible</w:t>
-      </w:r>
+        <w:t xml:space="preserve">Fixed the front camera overlay to be rounded and in the corner by scaling it to 25% size and translating it to the corner. Shrink first, then reset origin to not mess up positioning. To create the rounded frame, first create a white rounded rectangle, convert to </w:t>
+      </w:r>
+      <w:proofErr w:type="spellStart"/>
+      <w:r>
+        <w:t>CIImage</w:t>
+      </w:r>
+      <w:proofErr w:type="spellEnd"/>
+      <w:r>
+        <w:t xml:space="preserve"> and position it over the front frame, so that only the parts of the camera in white are shown, rest is </w:t>
+      </w:r>
+      <w:proofErr w:type="gramStart"/>
+      <w:r>
+        <w:t>invisible</w:t>
+      </w:r>
+      <w:proofErr w:type="gramEnd"/>
     </w:p>
     <w:p>
       <w:pPr>
@@ -249,8 +367,29 @@
         </w:numPr>
       </w:pPr>
       <w:r>
-        <w:t>Draw timestamp as UIImage and place convert to CIImage, position over video</w:t>
-      </w:r>
+        <w:t xml:space="preserve">Draw timestamp as </w:t>
+      </w:r>
+      <w:proofErr w:type="spellStart"/>
+      <w:r>
+        <w:t>UIImage</w:t>
+      </w:r>
+      <w:proofErr w:type="spellEnd"/>
+      <w:r>
+        <w:t xml:space="preserve"> and place convert to </w:t>
+      </w:r>
+      <w:proofErr w:type="spellStart"/>
+      <w:r>
+        <w:t>CIImage</w:t>
+      </w:r>
+      <w:proofErr w:type="spellEnd"/>
+      <w:r>
+        <w:t xml:space="preserve">, position over </w:t>
+      </w:r>
+      <w:proofErr w:type="gramStart"/>
+      <w:r>
+        <w:t>video</w:t>
+      </w:r>
+      <w:proofErr w:type="gramEnd"/>
     </w:p>
     <w:p>
       <w:pPr>
@@ -276,7 +415,15 @@
         </w:numPr>
       </w:pPr>
       <w:r>
-        <w:t>Learning about Queues and background thread, Swift has multiple background threads and one main thread, and you can have asynchronous tasks on each thread. But each asynchronous task gets put into a Queue so the asynchronous tasks are asynchronous with the synchronous tasks, but all the asynchronous tasks are synchronous with each other and form a Queue. You can put them all in different background threads to be fully parallel. You can also name a Queue to serialize them and put certain services into the same thread if you wish them to execute in order when they depend on each other.</w:t>
+        <w:t xml:space="preserve">Learning about Queues and background thread, Swift has multiple background threads and one main thread, and you can have asynchronous tasks on each thread. But each asynchronous task gets put into a </w:t>
+      </w:r>
+      <w:proofErr w:type="gramStart"/>
+      <w:r>
+        <w:t>Queue</w:t>
+      </w:r>
+      <w:proofErr w:type="gramEnd"/>
+      <w:r>
+        <w:t xml:space="preserve"> so the asynchronous tasks are asynchronous with the synchronous tasks, but all the asynchronous tasks are synchronous with each other and form a Queue. You can put them all in different background threads to be fully parallel. You can also name a Queue to serialize them and put certain services into the same thread if you wish them to execute in order when they depend on each other.</w:t>
       </w:r>
     </w:p>
     <w:p>
@@ -288,8 +435,13 @@
         </w:numPr>
       </w:pPr>
       <w:r>
-        <w:t>Fixed transcript reset so it works on subsequent recordings</w:t>
-      </w:r>
+        <w:t xml:space="preserve">Fixed transcript reset so it works on subsequent </w:t>
+      </w:r>
+      <w:proofErr w:type="gramStart"/>
+      <w:r>
+        <w:t>recordings</w:t>
+      </w:r>
+      <w:proofErr w:type="gramEnd"/>
     </w:p>
     <w:p>
       <w:pPr>
@@ -303,8 +455,13 @@
         <w:t>Subsequent recordings start recording immediately</w:t>
       </w:r>
       <w:r>
-        <w:t xml:space="preserve"> – reduced latency</w:t>
-      </w:r>
+        <w:t xml:space="preserve"> – reduced </w:t>
+      </w:r>
+      <w:proofErr w:type="gramStart"/>
+      <w:r>
+        <w:t>latency</w:t>
+      </w:r>
+      <w:proofErr w:type="gramEnd"/>
     </w:p>
     <w:p>
       <w:pPr>
@@ -327,8 +484,13 @@
         </w:numPr>
       </w:pPr>
       <w:r>
-        <w:t>Will create an endpoint for video uploads, Lambda provides a temporary private URL that uploads straight to S3 since API gateway has 10MB limit and won’t allow videos</w:t>
-      </w:r>
+        <w:t xml:space="preserve">Will create an endpoint for video uploads, Lambda provides a temporary private URL that uploads straight to S3 since API gateway has 10MB limit and won’t allow </w:t>
+      </w:r>
+      <w:proofErr w:type="gramStart"/>
+      <w:r>
+        <w:t>videos</w:t>
+      </w:r>
+      <w:proofErr w:type="gramEnd"/>
     </w:p>
     <w:p>
       <w:pPr>
@@ -339,8 +501,13 @@
         </w:numPr>
       </w:pPr>
       <w:r>
-        <w:t>Created Lambda serverless file skeleton</w:t>
-      </w:r>
+        <w:t xml:space="preserve">Created Lambda serverless file </w:t>
+      </w:r>
+      <w:proofErr w:type="gramStart"/>
+      <w:r>
+        <w:t>skeleton</w:t>
+      </w:r>
+      <w:proofErr w:type="gramEnd"/>
     </w:p>
     <w:p>
       <w:pPr>
@@ -352,8 +519,21 @@
       </w:pPr>
       <w:r>
         <w:lastRenderedPageBreak/>
-        <w:t>Generate temporary url for video upload</w:t>
-      </w:r>
+        <w:t xml:space="preserve">Generate temporary </w:t>
+      </w:r>
+      <w:proofErr w:type="spellStart"/>
+      <w:r>
+        <w:t>url</w:t>
+      </w:r>
+      <w:proofErr w:type="spellEnd"/>
+      <w:r>
+        <w:t xml:space="preserve"> for video </w:t>
+      </w:r>
+      <w:proofErr w:type="gramStart"/>
+      <w:r>
+        <w:t>upload</w:t>
+      </w:r>
+      <w:proofErr w:type="gramEnd"/>
     </w:p>
     <w:p>
       <w:pPr>
@@ -379,11 +559,24 @@
         </w:numPr>
       </w:pPr>
       <w:r>
-        <w:t>Set up AWS presigning URL</w:t>
-      </w:r>
-      <w:r>
-        <w:t xml:space="preserve"> for S3 bucket</w:t>
-      </w:r>
+        <w:t xml:space="preserve">Set up AWS </w:t>
+      </w:r>
+      <w:proofErr w:type="spellStart"/>
+      <w:r>
+        <w:t>presigning</w:t>
+      </w:r>
+      <w:proofErr w:type="spellEnd"/>
+      <w:r>
+        <w:t xml:space="preserve"> URL</w:t>
+      </w:r>
+      <w:r>
+        <w:t xml:space="preserve"> for S3 </w:t>
+      </w:r>
+      <w:proofErr w:type="gramStart"/>
+      <w:r>
+        <w:t>bucket</w:t>
+      </w:r>
+      <w:proofErr w:type="gramEnd"/>
     </w:p>
     <w:p>
       <w:pPr>
@@ -409,8 +602,21 @@
         </w:numPr>
       </w:pPr>
       <w:r>
-        <w:t>Amazon Bedrock doesn’t work and has significant rate limit issues, switching to OpenAI SDK to call Nova directly, bypassing the rate limit</w:t>
-      </w:r>
+        <w:t xml:space="preserve">Amazon Bedrock doesn’t work and has significant rate limit issues, switching to </w:t>
+      </w:r>
+      <w:proofErr w:type="spellStart"/>
+      <w:r>
+        <w:t>OpenAI</w:t>
+      </w:r>
+      <w:proofErr w:type="spellEnd"/>
+      <w:r>
+        <w:t xml:space="preserve"> SDK to call Nova directly, bypassing the rate </w:t>
+      </w:r>
+      <w:proofErr w:type="gramStart"/>
+      <w:r>
+        <w:t>limit</w:t>
+      </w:r>
+      <w:proofErr w:type="gramEnd"/>
     </w:p>
     <w:p>
       <w:pPr>
@@ -421,8 +627,15 @@
         </w:numPr>
       </w:pPr>
       <w:r>
-        <w:t>Added Lambda layer for open ai sdk</w:t>
-      </w:r>
+        <w:t xml:space="preserve">Added Lambda layer for open ai </w:t>
+      </w:r>
+      <w:proofErr w:type="spellStart"/>
+      <w:proofErr w:type="gramStart"/>
+      <w:r>
+        <w:t>sdk</w:t>
+      </w:r>
+      <w:proofErr w:type="spellEnd"/>
+      <w:proofErr w:type="gramEnd"/>
     </w:p>
     <w:p>
       <w:pPr>
@@ -432,8 +645,29 @@
           <w:numId w:val="6"/>
         </w:numPr>
       </w:pPr>
-      <w:r>
-        <w:t>OpenAI package depends on pydantic which is written in C/Rust. Pip install on Mac downloads binaries compiled for arm64, whereas Lambda runs on Amazon Linux</w:t>
+      <w:proofErr w:type="spellStart"/>
+      <w:r>
+        <w:t>OpenAI</w:t>
+      </w:r>
+      <w:proofErr w:type="spellEnd"/>
+      <w:r>
+        <w:t xml:space="preserve"> package depends on </w:t>
+      </w:r>
+      <w:proofErr w:type="spellStart"/>
+      <w:r>
+        <w:t>pydantic</w:t>
+      </w:r>
+      <w:proofErr w:type="spellEnd"/>
+      <w:r>
+        <w:t xml:space="preserve"> which is written in C/Rust. Pip </w:t>
+      </w:r>
+      <w:proofErr w:type="gramStart"/>
+      <w:r>
+        <w:t>install</w:t>
+      </w:r>
+      <w:proofErr w:type="gramEnd"/>
+      <w:r>
+        <w:t xml:space="preserve"> on Mac downloads binaries compiled for arm64, whereas Lambda runs on Amazon Linux</w:t>
       </w:r>
     </w:p>
     <w:p>
@@ -445,8 +679,21 @@
         </w:numPr>
       </w:pPr>
       <w:r>
-        <w:t>Ran a Docker container to install and zip the python sdk in Linux, then uploaded to Lambda</w:t>
-      </w:r>
+        <w:t xml:space="preserve">Ran a Docker container to install and zip the python </w:t>
+      </w:r>
+      <w:proofErr w:type="spellStart"/>
+      <w:r>
+        <w:t>sdk</w:t>
+      </w:r>
+      <w:proofErr w:type="spellEnd"/>
+      <w:r>
+        <w:t xml:space="preserve"> in Linux, then uploaded to </w:t>
+      </w:r>
+      <w:proofErr w:type="gramStart"/>
+      <w:r>
+        <w:t>Lambda</w:t>
+      </w:r>
+      <w:proofErr w:type="gramEnd"/>
     </w:p>
     <w:p>
       <w:pPr>
@@ -471,9 +718,11 @@
       <w:r>
         <w:t xml:space="preserve">No longer using Nova 2 Sonic, it is not good for transcription, too much work when Apple is </w:t>
       </w:r>
+      <w:proofErr w:type="gramStart"/>
       <w:r>
         <w:t>sufficient</w:t>
       </w:r>
+      <w:proofErr w:type="gramEnd"/>
     </w:p>
     <w:p>
       <w:pPr>
@@ -511,8 +760,13 @@
         </w:numPr>
       </w:pPr>
       <w:r>
-        <w:t>API service contains all the http functions to Lambda</w:t>
-      </w:r>
+        <w:t xml:space="preserve">API service contains all the http functions to </w:t>
+      </w:r>
+      <w:proofErr w:type="gramStart"/>
+      <w:r>
+        <w:t>Lambda</w:t>
+      </w:r>
+      <w:proofErr w:type="gramEnd"/>
     </w:p>
     <w:p>
       <w:pPr>
@@ -522,9 +776,19 @@
           <w:numId w:val="7"/>
         </w:numPr>
       </w:pPr>
-      <w:r>
-        <w:t>AnalysisViewModel calls all the API services and connects the entire analysis pipeline + updates the UI message for loading during analysis</w:t>
-      </w:r>
+      <w:proofErr w:type="spellStart"/>
+      <w:r>
+        <w:t>AnalysisViewModel</w:t>
+      </w:r>
+      <w:proofErr w:type="spellEnd"/>
+      <w:r>
+        <w:t xml:space="preserve"> calls all the API services and connects the entire analysis pipeline + updates the UI message for loading during </w:t>
+      </w:r>
+      <w:proofErr w:type="gramStart"/>
+      <w:r>
+        <w:t>analysis</w:t>
+      </w:r>
+      <w:proofErr w:type="gramEnd"/>
     </w:p>
     <w:p>
       <w:pPr>
@@ -550,8 +814,13 @@
         </w:numPr>
       </w:pPr>
       <w:r>
-        <w:t>Made UI for loading, analysis, reports, different tab views</w:t>
-      </w:r>
+        <w:t xml:space="preserve">Made UI for loading, analysis, reports, different tab </w:t>
+      </w:r>
+      <w:proofErr w:type="gramStart"/>
+      <w:r>
+        <w:t>views</w:t>
+      </w:r>
+      <w:proofErr w:type="gramEnd"/>
     </w:p>
     <w:p>
       <w:pPr>
@@ -562,8 +831,29 @@
         </w:numPr>
       </w:pPr>
       <w:r>
-        <w:t>Fixed deletion of reports locally, since before it would generate a new uuid for each report everytime they were opened</w:t>
-      </w:r>
+        <w:t xml:space="preserve">Fixed deletion of reports locally, since before it would generate a new </w:t>
+      </w:r>
+      <w:proofErr w:type="spellStart"/>
+      <w:r>
+        <w:t>uuid</w:t>
+      </w:r>
+      <w:proofErr w:type="spellEnd"/>
+      <w:r>
+        <w:t xml:space="preserve"> for each report </w:t>
+      </w:r>
+      <w:proofErr w:type="spellStart"/>
+      <w:r>
+        <w:t>everytime</w:t>
+      </w:r>
+      <w:proofErr w:type="spellEnd"/>
+      <w:r>
+        <w:t xml:space="preserve"> they were </w:t>
+      </w:r>
+      <w:proofErr w:type="gramStart"/>
+      <w:r>
+        <w:t>opened</w:t>
+      </w:r>
+      <w:proofErr w:type="gramEnd"/>
     </w:p>
     <w:p>
       <w:pPr>
@@ -574,7 +864,81 @@
         </w:numPr>
       </w:pPr>
       <w:r>
-        <w:t>Add video locally to report</w:t>
+        <w:t xml:space="preserve">Add video locally to </w:t>
+      </w:r>
+      <w:proofErr w:type="gramStart"/>
+      <w:r>
+        <w:t>report</w:t>
+      </w:r>
+      <w:proofErr w:type="gramEnd"/>
+    </w:p>
+    <w:p>
+      <w:pPr>
+        <w:rPr>
+          <w:b/>
+          <w:bCs/>
+        </w:rPr>
+      </w:pPr>
+      <w:r>
+        <w:rPr>
+          <w:b/>
+          <w:bCs/>
+        </w:rPr>
+        <w:t>Feb 27, 2026</w:t>
+      </w:r>
+    </w:p>
+    <w:p>
+      <w:pPr>
+        <w:pStyle w:val="ListParagraph"/>
+        <w:numPr>
+          <w:ilvl w:val="0"/>
+          <w:numId w:val="9"/>
+        </w:numPr>
+      </w:pPr>
+      <w:r>
+        <w:t xml:space="preserve">It is bad with different languages, not good at identifying texts and audio in different </w:t>
+      </w:r>
+      <w:proofErr w:type="gramStart"/>
+      <w:r>
+        <w:t>languages</w:t>
+      </w:r>
+      <w:proofErr w:type="gramEnd"/>
+    </w:p>
+    <w:p>
+      <w:pPr>
+        <w:pStyle w:val="ListParagraph"/>
+        <w:numPr>
+          <w:ilvl w:val="0"/>
+          <w:numId w:val="9"/>
+        </w:numPr>
+      </w:pPr>
+      <w:r>
+        <w:t xml:space="preserve">AWS Transcription doesn’t work, get </w:t>
+      </w:r>
+      <w:proofErr w:type="gramStart"/>
+      <w:r>
+        <w:t>error</w:t>
+      </w:r>
+      <w:proofErr w:type="gramEnd"/>
+    </w:p>
+    <w:p>
+      <w:pPr>
+        <w:pStyle w:val="ListParagraph"/>
+        <w:numPr>
+          <w:ilvl w:val="0"/>
+          <w:numId w:val="9"/>
+        </w:numPr>
+      </w:pPr>
+      <w:r>
+        <w:t xml:space="preserve">Tried GCP + </w:t>
+      </w:r>
+      <w:proofErr w:type="spellStart"/>
+      <w:r>
+        <w:t>ffmpeg</w:t>
+      </w:r>
+      <w:proofErr w:type="spellEnd"/>
+      <w:r>
+        <w:t xml:space="preserve"> for translation + transcription but the pipeline didn’t work</w:t>
       </w:r>
     </w:p>
     <w:sectPr>
@@ -816,6 +1180,119 @@
     </w:lvl>
   </w:abstractNum>
   <w:abstractNum w:abstractNumId="2" w15:restartNumberingAfterBreak="0">
+    <w:nsid w:val="2A96019E"/>
+    <w:multiLevelType w:val="hybridMultilevel"/>
+    <w:tmpl w:val="8B363D88"/>
+    <w:lvl w:ilvl="0" w:tplc="04090001">
+      <w:start w:val="1"/>
+      <w:numFmt w:val="bullet"/>
+      <w:lvlText w:val=""/>
+      <w:lvlJc w:val="left"/>
+      <w:pPr>
+        <w:ind w:left="720" w:hanging="360"/>
+      </w:pPr>
+      <w:rPr>
+        <w:rFonts w:ascii="Symbol" w:hAnsi="Symbol" w:hint="default"/>
+      </w:rPr>
+    </w:lvl>
+    <w:lvl w:ilvl="1" w:tplc="04090003" w:tentative="1">
+      <w:start w:val="1"/>
+      <w:numFmt w:val="bullet"/>
+      <w:lvlText w:val="o"/>
+      <w:lvlJc w:val="left"/>
+      <w:pPr>
+        <w:ind w:left="1440" w:hanging="360"/>
+      </w:pPr>
+      <w:rPr>
+        <w:rFonts w:ascii="Courier New" w:hAnsi="Courier New" w:cs="Courier New" w:hint="default"/>
+      </w:rPr>
+    </w:lvl>
+    <w:lvl w:ilvl="2" w:tplc="04090005" w:tentative="1">
+      <w:start w:val="1"/>
+      <w:numFmt w:val="bullet"/>
+      <w:lvlText w:val=""/>
+      <w:lvlJc w:val="left"/>
+      <w:pPr>
+        <w:ind w:left="2160" w:hanging="360"/>
+      </w:pPr>
+      <w:rPr>
+        <w:rFonts w:ascii="Wingdings" w:hAnsi="Wingdings" w:hint="default"/>
+      </w:rPr>
+    </w:lvl>
+    <w:lvl w:ilvl="3" w:tplc="04090001" w:tentative="1">
+      <w:start w:val="1"/>
+      <w:numFmt w:val="bullet"/>
+      <w:lvlText w:val=""/>
+      <w:lvlJc w:val="left"/>
+      <w:pPr>
+        <w:ind w:left="2880" w:hanging="360"/>
+      </w:pPr>
+      <w:rPr>
+        <w:rFonts w:ascii="Symbol" w:hAnsi="Symbol" w:hint="default"/>
+      </w:rPr>
+    </w:lvl>
+    <w:lvl w:ilvl="4" w:tplc="04090003" w:tentative="1">
+      <w:start w:val="1"/>
+      <w:numFmt w:val="bullet"/>
+      <w:lvlText w:val="o"/>
+      <w:lvlJc w:val="left"/>
+      <w:pPr>
+        <w:ind w:left="3600" w:hanging="360"/>
+      </w:pPr>
+      <w:rPr>
+        <w:rFonts w:ascii="Courier New" w:hAnsi="Courier New" w:cs="Courier New" w:hint="default"/>
+      </w:rPr>
+    </w:lvl>
+    <w:lvl w:ilvl="5" w:tplc="04090005" w:tentative="1">
+      <w:start w:val="1"/>
+      <w:numFmt w:val="bullet"/>
+      <w:lvlText w:val=""/>
+      <w:lvlJc w:val="left"/>
+      <w:pPr>
+        <w:ind w:left="4320" w:hanging="360"/>
+      </w:pPr>
+      <w:rPr>
+        <w:rFonts w:ascii="Wingdings" w:hAnsi="Wingdings" w:hint="default"/>
+      </w:rPr>
+    </w:lvl>
+    <w:lvl w:ilvl="6" w:tplc="04090001" w:tentative="1">
+      <w:start w:val="1"/>
+      <w:numFmt w:val="bullet"/>
+      <w:lvlText w:val=""/>
+      <w:lvlJc w:val="left"/>
+      <w:pPr>
+        <w:ind w:left="5040" w:hanging="360"/>
+      </w:pPr>
+      <w:rPr>
+        <w:rFonts w:ascii="Symbol" w:hAnsi="Symbol" w:hint="default"/>
+      </w:rPr>
+    </w:lvl>
+    <w:lvl w:ilvl="7" w:tplc="04090003" w:tentative="1">
+      <w:start w:val="1"/>
+      <w:numFmt w:val="bullet"/>
+      <w:lvlText w:val="o"/>
+      <w:lvlJc w:val="left"/>
+      <w:pPr>
+        <w:ind w:left="5760" w:hanging="360"/>
+      </w:pPr>
+      <w:rPr>
+        <w:rFonts w:ascii="Courier New" w:hAnsi="Courier New" w:cs="Courier New" w:hint="default"/>
+      </w:rPr>
+    </w:lvl>
+    <w:lvl w:ilvl="8" w:tplc="04090005" w:tentative="1">
+      <w:start w:val="1"/>
+      <w:numFmt w:val="bullet"/>
+      <w:lvlText w:val=""/>
+      <w:lvlJc w:val="left"/>
+      <w:pPr>
+        <w:ind w:left="6480" w:hanging="360"/>
+      </w:pPr>
+      <w:rPr>
+        <w:rFonts w:ascii="Wingdings" w:hAnsi="Wingdings" w:hint="default"/>
+      </w:rPr>
+    </w:lvl>
+  </w:abstractNum>
+  <w:abstractNum w:abstractNumId="3" w15:restartNumberingAfterBreak="0">
     <w:nsid w:val="32297CB9"/>
     <w:multiLevelType w:val="hybridMultilevel"/>
     <w:tmpl w:val="0BBCA938"/>
@@ -928,7 +1405,7 @@
       </w:rPr>
     </w:lvl>
   </w:abstractNum>
-  <w:abstractNum w:abstractNumId="3" w15:restartNumberingAfterBreak="0">
+  <w:abstractNum w:abstractNumId="4" w15:restartNumberingAfterBreak="0">
     <w:nsid w:val="32616D01"/>
     <w:multiLevelType w:val="hybridMultilevel"/>
     <w:tmpl w:val="02364A86"/>
@@ -1041,7 +1518,7 @@
       </w:rPr>
     </w:lvl>
   </w:abstractNum>
-  <w:abstractNum w:abstractNumId="4" w15:restartNumberingAfterBreak="0">
+  <w:abstractNum w:abstractNumId="5" w15:restartNumberingAfterBreak="0">
     <w:nsid w:val="37ED4650"/>
     <w:multiLevelType w:val="hybridMultilevel"/>
     <w:tmpl w:val="60B46E30"/>
@@ -1154,7 +1631,7 @@
       </w:rPr>
     </w:lvl>
   </w:abstractNum>
-  <w:abstractNum w:abstractNumId="5" w15:restartNumberingAfterBreak="0">
+  <w:abstractNum w:abstractNumId="6" w15:restartNumberingAfterBreak="0">
     <w:nsid w:val="5D233F80"/>
     <w:multiLevelType w:val="hybridMultilevel"/>
     <w:tmpl w:val="B5B2EF32"/>
@@ -1267,7 +1744,7 @@
       </w:rPr>
     </w:lvl>
   </w:abstractNum>
-  <w:abstractNum w:abstractNumId="6" w15:restartNumberingAfterBreak="0">
+  <w:abstractNum w:abstractNumId="7" w15:restartNumberingAfterBreak="0">
     <w:nsid w:val="6EE05CBE"/>
     <w:multiLevelType w:val="hybridMultilevel"/>
     <w:tmpl w:val="515E1B30"/>
@@ -1380,7 +1857,7 @@
       </w:rPr>
     </w:lvl>
   </w:abstractNum>
-  <w:abstractNum w:abstractNumId="7" w15:restartNumberingAfterBreak="0">
+  <w:abstractNum w:abstractNumId="8" w15:restartNumberingAfterBreak="0">
     <w:nsid w:val="72AD149A"/>
     <w:multiLevelType w:val="hybridMultilevel"/>
     <w:tmpl w:val="0ED8BA0C"/>
@@ -1497,25 +1974,28 @@
     <w:abstractNumId w:val="1"/>
   </w:num>
   <w:num w:numId="2" w16cid:durableId="1065492894">
+    <w:abstractNumId w:val="7"/>
+  </w:num>
+  <w:num w:numId="3" w16cid:durableId="1901019889">
     <w:abstractNumId w:val="6"/>
   </w:num>
-  <w:num w:numId="3" w16cid:durableId="1901019889">
-    <w:abstractNumId w:val="5"/>
-  </w:num>
   <w:num w:numId="4" w16cid:durableId="452483282">
-    <w:abstractNumId w:val="3"/>
+    <w:abstractNumId w:val="4"/>
   </w:num>
   <w:num w:numId="5" w16cid:durableId="1832793299">
-    <w:abstractNumId w:val="2"/>
+    <w:abstractNumId w:val="3"/>
   </w:num>
   <w:num w:numId="6" w16cid:durableId="1140150217">
     <w:abstractNumId w:val="0"/>
   </w:num>
   <w:num w:numId="7" w16cid:durableId="1105341004">
-    <w:abstractNumId w:val="7"/>
+    <w:abstractNumId w:val="8"/>
   </w:num>
   <w:num w:numId="8" w16cid:durableId="1869566375">
-    <w:abstractNumId w:val="4"/>
+    <w:abstractNumId w:val="5"/>
+  </w:num>
+  <w:num w:numId="9" w16cid:durableId="98448324">
+    <w:abstractNumId w:val="2"/>
   </w:num>
 </w:numbering>
 </file>

</xml_diff>

<commit_message>
update permission requests, sequential
</commit_message>
<xml_diff>
--- a/Recon logs.docx
+++ b/Recon logs.docx
@@ -938,7 +938,41 @@
       </w:r>
       <w:proofErr w:type="spellEnd"/>
       <w:r>
-        <w:t xml:space="preserve"> for translation + transcription but the pipeline didn’t work</w:t>
+        <w:t xml:space="preserve"> for translation + transcription but the pipeline didn’t </w:t>
+      </w:r>
+      <w:proofErr w:type="gramStart"/>
+      <w:r>
+        <w:t>work</w:t>
+      </w:r>
+      <w:proofErr w:type="gramEnd"/>
+    </w:p>
+    <w:p>
+      <w:pPr>
+        <w:pStyle w:val="ListParagraph"/>
+        <w:numPr>
+          <w:ilvl w:val="0"/>
+          <w:numId w:val="9"/>
+        </w:numPr>
+      </w:pPr>
+      <w:r>
+        <w:t xml:space="preserve">Not smart to do two </w:t>
+      </w:r>
+      <w:proofErr w:type="gramStart"/>
+      <w:r>
+        <w:t>calls</w:t>
+      </w:r>
+      <w:proofErr w:type="gramEnd"/>
+    </w:p>
+    <w:p>
+      <w:pPr>
+        <w:pStyle w:val="ListParagraph"/>
+        <w:numPr>
+          <w:ilvl w:val="0"/>
+          <w:numId w:val="9"/>
+        </w:numPr>
+      </w:pPr>
+      <w:r>
+        <w:t>Manual language selector in app for Apple transcription, tested it out and Nova 2 Lite can understand and process audios in different languages if it knows the language in advance</w:t>
       </w:r>
     </w:p>
     <w:sectPr>

</xml_diff>

<commit_message>
logs: debugging the camera while on call (no audio)
</commit_message>
<xml_diff>
--- a/Recon logs.docx
+++ b/Recon logs.docx
@@ -972,7 +972,238 @@
         </w:numPr>
       </w:pPr>
       <w:r>
-        <w:t>Manual language selector in app for Apple transcription, tested it out and Nova 2 Lite can understand and process audios in different languages if it knows the language in advance</w:t>
+        <w:t xml:space="preserve">Manual language selector in app for Apple transcription, tested it out and Nova 2 Lite can understand and process audios in different languages if it knows the language in </w:t>
+      </w:r>
+      <w:proofErr w:type="gramStart"/>
+      <w:r>
+        <w:t>advance</w:t>
+      </w:r>
+      <w:proofErr w:type="gramEnd"/>
+    </w:p>
+    <w:p>
+      <w:pPr>
+        <w:rPr>
+          <w:b/>
+          <w:bCs/>
+        </w:rPr>
+      </w:pPr>
+      <w:r>
+        <w:rPr>
+          <w:b/>
+          <w:bCs/>
+        </w:rPr>
+        <w:t>Mar 5, 2026</w:t>
+      </w:r>
+    </w:p>
+    <w:p>
+      <w:pPr>
+        <w:pStyle w:val="ListParagraph"/>
+        <w:numPr>
+          <w:ilvl w:val="0"/>
+          <w:numId w:val="10"/>
+        </w:numPr>
+      </w:pPr>
+      <w:proofErr w:type="spellStart"/>
+      <w:r>
+        <w:t>AVAudioSession</w:t>
+      </w:r>
+      <w:proofErr w:type="spellEnd"/>
+      <w:r>
+        <w:t xml:space="preserve"> and </w:t>
+      </w:r>
+      <w:proofErr w:type="spellStart"/>
+      <w:r>
+        <w:t>AVCaptureSession</w:t>
+      </w:r>
+      <w:proofErr w:type="spellEnd"/>
+      <w:r>
+        <w:t xml:space="preserve"> are shared systems on a device, on call, they take exclusive control of audio, but both are coupled so camera gets frozen on </w:t>
+      </w:r>
+      <w:proofErr w:type="gramStart"/>
+      <w:r>
+        <w:t>call</w:t>
+      </w:r>
+      <w:proofErr w:type="gramEnd"/>
+    </w:p>
+    <w:p>
+      <w:pPr>
+        <w:pStyle w:val="ListParagraph"/>
+        <w:numPr>
+          <w:ilvl w:val="0"/>
+          <w:numId w:val="10"/>
+        </w:numPr>
+      </w:pPr>
+      <w:proofErr w:type="spellStart"/>
+      <w:r>
+        <w:t>setActive</w:t>
+      </w:r>
+      <w:proofErr w:type="spellEnd"/>
+      <w:r>
+        <w:t xml:space="preserve">(true) is saying “I’m using audio right now” and doesn’t let system renegotiate </w:t>
+      </w:r>
+      <w:proofErr w:type="gramStart"/>
+      <w:r>
+        <w:t>control</w:t>
+      </w:r>
+      <w:proofErr w:type="gramEnd"/>
+    </w:p>
+    <w:p>
+      <w:pPr>
+        <w:pStyle w:val="ListParagraph"/>
+        <w:numPr>
+          <w:ilvl w:val="0"/>
+          <w:numId w:val="10"/>
+        </w:numPr>
+      </w:pPr>
+      <w:r>
+        <w:t xml:space="preserve">Initially, app would </w:t>
+      </w:r>
+      <w:proofErr w:type="gramStart"/>
+      <w:r>
+        <w:t>call .ambient</w:t>
+      </w:r>
+      <w:proofErr w:type="gramEnd"/>
+      <w:r>
+        <w:t xml:space="preserve"> (need audio but passive – optional), however, over a call where control isn’t negotiable, can interfere with the call so system might stall the pipeline</w:t>
+      </w:r>
+    </w:p>
+    <w:p>
+      <w:pPr>
+        <w:pStyle w:val="ListParagraph"/>
+        <w:numPr>
+          <w:ilvl w:val="0"/>
+          <w:numId w:val="10"/>
+        </w:numPr>
+      </w:pPr>
+      <w:r>
+        <w:t>Interruption handler</w:t>
+      </w:r>
+    </w:p>
+    <w:p>
+      <w:pPr>
+        <w:pStyle w:val="ListParagraph"/>
+        <w:numPr>
+          <w:ilvl w:val="1"/>
+          <w:numId w:val="10"/>
+        </w:numPr>
+      </w:pPr>
+      <w:r>
+        <w:t xml:space="preserve">When phone call begins, iOS sends </w:t>
+      </w:r>
+      <w:proofErr w:type="spellStart"/>
+      <w:r>
+        <w:t>AVAudioSession.interruptionNotification</w:t>
+      </w:r>
+      <w:proofErr w:type="spellEnd"/>
+      <w:r>
+        <w:t xml:space="preserve"> which the app will call </w:t>
+      </w:r>
+      <w:proofErr w:type="spellStart"/>
+      <w:proofErr w:type="gramStart"/>
+      <w:r>
+        <w:t>session.stopRunning</w:t>
+      </w:r>
+      <w:proofErr w:type="spellEnd"/>
+      <w:proofErr w:type="gramEnd"/>
+      <w:r>
+        <w:t>(), killing the camera preview entirely</w:t>
+      </w:r>
+    </w:p>
+    <w:p>
+      <w:pPr>
+        <w:pStyle w:val="ListParagraph"/>
+        <w:numPr>
+          <w:ilvl w:val="1"/>
+          <w:numId w:val="10"/>
+        </w:numPr>
+      </w:pPr>
+      <w:r>
+        <w:t xml:space="preserve">App will rebuild everything, remove all I/O and readd cameras, reconfigure, however, due to the previous issue, it would </w:t>
+      </w:r>
+      <w:proofErr w:type="gramStart"/>
+      <w:r>
+        <w:t>freeze</w:t>
+      </w:r>
+      <w:proofErr w:type="gramEnd"/>
+    </w:p>
+    <w:p>
+      <w:pPr>
+        <w:pStyle w:val="ListParagraph"/>
+        <w:numPr>
+          <w:ilvl w:val="0"/>
+          <w:numId w:val="10"/>
+        </w:numPr>
+      </w:pPr>
+      <w:r>
+        <w:t xml:space="preserve">First fix – don’t touch </w:t>
+      </w:r>
+      <w:proofErr w:type="spellStart"/>
+      <w:r>
+        <w:t>AVAudioSession</w:t>
+      </w:r>
+      <w:proofErr w:type="spellEnd"/>
+      <w:r>
+        <w:t xml:space="preserve"> when we don’t need audio, camera runs video-only, no need to negotiate the audio </w:t>
+      </w:r>
+      <w:proofErr w:type="gramStart"/>
+      <w:r>
+        <w:t>service</w:t>
+      </w:r>
+      <w:proofErr w:type="gramEnd"/>
+    </w:p>
+    <w:p>
+      <w:pPr>
+        <w:pStyle w:val="ListParagraph"/>
+        <w:numPr>
+          <w:ilvl w:val="0"/>
+          <w:numId w:val="10"/>
+        </w:numPr>
+      </w:pPr>
+      <w:r>
+        <w:t xml:space="preserve">Second fix – for interruption handler, instead of stopping everything, just detach the audio from the video </w:t>
+      </w:r>
+      <w:proofErr w:type="gramStart"/>
+      <w:r>
+        <w:t>service</w:t>
+      </w:r>
+      <w:proofErr w:type="gramEnd"/>
+    </w:p>
+    <w:p>
+      <w:pPr>
+        <w:pStyle w:val="ListParagraph"/>
+        <w:numPr>
+          <w:ilvl w:val="0"/>
+          <w:numId w:val="10"/>
+        </w:numPr>
+      </w:pPr>
+      <w:r>
+        <w:t xml:space="preserve">This was difficult to fix because iOS ties audio and video together at the system level, there is no API that allows you to just extract the camera, be careful not to trigger any audio-related </w:t>
+      </w:r>
+      <w:proofErr w:type="gramStart"/>
+      <w:r>
+        <w:t>paths</w:t>
+      </w:r>
+      <w:proofErr w:type="gramEnd"/>
+    </w:p>
+    <w:p>
+      <w:pPr>
+        <w:pStyle w:val="ListParagraph"/>
+        <w:numPr>
+          <w:ilvl w:val="0"/>
+          <w:numId w:val="10"/>
+        </w:numPr>
+      </w:pPr>
+      <w:r>
+        <w:lastRenderedPageBreak/>
+        <w:t xml:space="preserve">Apple’s documentation doesn’t explicitly mention </w:t>
+      </w:r>
+      <w:proofErr w:type="spellStart"/>
+      <w:r>
+        <w:t>setActive</w:t>
+      </w:r>
+      <w:proofErr w:type="spellEnd"/>
+      <w:r>
+        <w:t>(true) freezes the camera, had to discover this on my own after testing a lot</w:t>
       </w:r>
     </w:p>
     <w:sectPr>
@@ -1779,6 +2010,119 @@
     </w:lvl>
   </w:abstractNum>
   <w:abstractNum w:abstractNumId="7" w15:restartNumberingAfterBreak="0">
+    <w:nsid w:val="6A365D7C"/>
+    <w:multiLevelType w:val="hybridMultilevel"/>
+    <w:tmpl w:val="6EBA4FAC"/>
+    <w:lvl w:ilvl="0" w:tplc="04090001">
+      <w:start w:val="1"/>
+      <w:numFmt w:val="bullet"/>
+      <w:lvlText w:val=""/>
+      <w:lvlJc w:val="left"/>
+      <w:pPr>
+        <w:ind w:left="720" w:hanging="360"/>
+      </w:pPr>
+      <w:rPr>
+        <w:rFonts w:ascii="Symbol" w:hAnsi="Symbol" w:hint="default"/>
+      </w:rPr>
+    </w:lvl>
+    <w:lvl w:ilvl="1" w:tplc="04090003">
+      <w:start w:val="1"/>
+      <w:numFmt w:val="bullet"/>
+      <w:lvlText w:val="o"/>
+      <w:lvlJc w:val="left"/>
+      <w:pPr>
+        <w:ind w:left="1440" w:hanging="360"/>
+      </w:pPr>
+      <w:rPr>
+        <w:rFonts w:ascii="Courier New" w:hAnsi="Courier New" w:cs="Courier New" w:hint="default"/>
+      </w:rPr>
+    </w:lvl>
+    <w:lvl w:ilvl="2" w:tplc="04090005" w:tentative="1">
+      <w:start w:val="1"/>
+      <w:numFmt w:val="bullet"/>
+      <w:lvlText w:val=""/>
+      <w:lvlJc w:val="left"/>
+      <w:pPr>
+        <w:ind w:left="2160" w:hanging="360"/>
+      </w:pPr>
+      <w:rPr>
+        <w:rFonts w:ascii="Wingdings" w:hAnsi="Wingdings" w:hint="default"/>
+      </w:rPr>
+    </w:lvl>
+    <w:lvl w:ilvl="3" w:tplc="04090001" w:tentative="1">
+      <w:start w:val="1"/>
+      <w:numFmt w:val="bullet"/>
+      <w:lvlText w:val=""/>
+      <w:lvlJc w:val="left"/>
+      <w:pPr>
+        <w:ind w:left="2880" w:hanging="360"/>
+      </w:pPr>
+      <w:rPr>
+        <w:rFonts w:ascii="Symbol" w:hAnsi="Symbol" w:hint="default"/>
+      </w:rPr>
+    </w:lvl>
+    <w:lvl w:ilvl="4" w:tplc="04090003" w:tentative="1">
+      <w:start w:val="1"/>
+      <w:numFmt w:val="bullet"/>
+      <w:lvlText w:val="o"/>
+      <w:lvlJc w:val="left"/>
+      <w:pPr>
+        <w:ind w:left="3600" w:hanging="360"/>
+      </w:pPr>
+      <w:rPr>
+        <w:rFonts w:ascii="Courier New" w:hAnsi="Courier New" w:cs="Courier New" w:hint="default"/>
+      </w:rPr>
+    </w:lvl>
+    <w:lvl w:ilvl="5" w:tplc="04090005" w:tentative="1">
+      <w:start w:val="1"/>
+      <w:numFmt w:val="bullet"/>
+      <w:lvlText w:val=""/>
+      <w:lvlJc w:val="left"/>
+      <w:pPr>
+        <w:ind w:left="4320" w:hanging="360"/>
+      </w:pPr>
+      <w:rPr>
+        <w:rFonts w:ascii="Wingdings" w:hAnsi="Wingdings" w:hint="default"/>
+      </w:rPr>
+    </w:lvl>
+    <w:lvl w:ilvl="6" w:tplc="04090001" w:tentative="1">
+      <w:start w:val="1"/>
+      <w:numFmt w:val="bullet"/>
+      <w:lvlText w:val=""/>
+      <w:lvlJc w:val="left"/>
+      <w:pPr>
+        <w:ind w:left="5040" w:hanging="360"/>
+      </w:pPr>
+      <w:rPr>
+        <w:rFonts w:ascii="Symbol" w:hAnsi="Symbol" w:hint="default"/>
+      </w:rPr>
+    </w:lvl>
+    <w:lvl w:ilvl="7" w:tplc="04090003" w:tentative="1">
+      <w:start w:val="1"/>
+      <w:numFmt w:val="bullet"/>
+      <w:lvlText w:val="o"/>
+      <w:lvlJc w:val="left"/>
+      <w:pPr>
+        <w:ind w:left="5760" w:hanging="360"/>
+      </w:pPr>
+      <w:rPr>
+        <w:rFonts w:ascii="Courier New" w:hAnsi="Courier New" w:cs="Courier New" w:hint="default"/>
+      </w:rPr>
+    </w:lvl>
+    <w:lvl w:ilvl="8" w:tplc="04090005" w:tentative="1">
+      <w:start w:val="1"/>
+      <w:numFmt w:val="bullet"/>
+      <w:lvlText w:val=""/>
+      <w:lvlJc w:val="left"/>
+      <w:pPr>
+        <w:ind w:left="6480" w:hanging="360"/>
+      </w:pPr>
+      <w:rPr>
+        <w:rFonts w:ascii="Wingdings" w:hAnsi="Wingdings" w:hint="default"/>
+      </w:rPr>
+    </w:lvl>
+  </w:abstractNum>
+  <w:abstractNum w:abstractNumId="8" w15:restartNumberingAfterBreak="0">
     <w:nsid w:val="6EE05CBE"/>
     <w:multiLevelType w:val="hybridMultilevel"/>
     <w:tmpl w:val="515E1B30"/>
@@ -1891,7 +2235,7 @@
       </w:rPr>
     </w:lvl>
   </w:abstractNum>
-  <w:abstractNum w:abstractNumId="8" w15:restartNumberingAfterBreak="0">
+  <w:abstractNum w:abstractNumId="9" w15:restartNumberingAfterBreak="0">
     <w:nsid w:val="72AD149A"/>
     <w:multiLevelType w:val="hybridMultilevel"/>
     <w:tmpl w:val="0ED8BA0C"/>
@@ -2008,7 +2352,7 @@
     <w:abstractNumId w:val="1"/>
   </w:num>
   <w:num w:numId="2" w16cid:durableId="1065492894">
-    <w:abstractNumId w:val="7"/>
+    <w:abstractNumId w:val="8"/>
   </w:num>
   <w:num w:numId="3" w16cid:durableId="1901019889">
     <w:abstractNumId w:val="6"/>
@@ -2023,13 +2367,16 @@
     <w:abstractNumId w:val="0"/>
   </w:num>
   <w:num w:numId="7" w16cid:durableId="1105341004">
-    <w:abstractNumId w:val="8"/>
+    <w:abstractNumId w:val="9"/>
   </w:num>
   <w:num w:numId="8" w16cid:durableId="1869566375">
     <w:abstractNumId w:val="5"/>
   </w:num>
   <w:num w:numId="9" w16cid:durableId="98448324">
     <w:abstractNumId w:val="2"/>
+  </w:num>
+  <w:num w:numId="10" w16cid:durableId="1034647425">
+    <w:abstractNumId w:val="7"/>
   </w:num>
 </w:numbering>
 </file>

</xml_diff>

<commit_message>
logs: camera in parallel on call
</commit_message>
<xml_diff>
--- a/Recon logs.docx
+++ b/Recon logs.docx
@@ -1118,13 +1118,14 @@
         </w:numPr>
       </w:pPr>
       <w:r>
-        <w:t xml:space="preserve">App will rebuild everything, remove all I/O and readd cameras, reconfigure, however, due to the previous issue, it would </w:t>
-      </w:r>
-      <w:proofErr w:type="gramStart"/>
-      <w:r>
-        <w:t>freeze</w:t>
-      </w:r>
-      <w:proofErr w:type="gramEnd"/>
+        <w:t>App will rebuild everything, remove all I/O and re</w:t>
+      </w:r>
+      <w:r>
+        <w:t>-</w:t>
+      </w:r>
+      <w:r>
+        <w:t>add cameras, reconfigure, however, due to the previous issue, it would freeze</w:t>
+      </w:r>
     </w:p>
     <w:p>
       <w:pPr>

</xml_diff>